<commit_message>
:bug: fixing small issues
</commit_message>
<xml_diff>
--- a/src/assets/planejamentoSemanal7.docx
+++ b/src/assets/planejamentoSemanal7.docx
@@ -17,14 +17,12 @@
           <w:rFonts w:ascii="Arial" w:hAnsi="Arial" w:eastAsia="Arial" w:cs="Arial"/>
           <w:b w:val="false"/>
           <w:i w:val="false"/>
-          <w:i w:val="false"/>
           <w:caps w:val="false"/>
           <w:smallCaps w:val="false"/>
           <w:strike w:val="false"/>
           <w:dstrike w:val="false"/>
           <w:color w:val="000000"/>
           <w:position w:val="0"/>
-          <w:sz w:val="22"/>
           <w:sz w:val="22"/>
           <w:szCs w:val="22"/>
           <w:u w:val="none"/>
@@ -43,7 +41,6 @@
           <w:dstrike w:val="false"/>
           <w:color w:val="000000"/>
           <w:position w:val="0"/>
-          <w:sz w:val="22"/>
           <w:sz w:val="22"/>
           <w:szCs w:val="22"/>
           <w:u w:val="none"/>
@@ -68,12 +65,12 @@
         <w:tblLook w:val="0000"/>
       </w:tblPr>
       <w:tblGrid>
-        <w:gridCol w:w="1260"/>
-        <w:gridCol w:w="3359"/>
+        <w:gridCol w:w="1259"/>
+        <w:gridCol w:w="3360"/>
         <w:gridCol w:w="2881"/>
         <w:gridCol w:w="2624"/>
         <w:gridCol w:w="2775"/>
-        <w:gridCol w:w="2655"/>
+        <w:gridCol w:w="2656"/>
       </w:tblGrid>
       <w:tr>
         <w:trPr>
@@ -81,7 +78,7 @@
         </w:trPr>
         <w:tc>
           <w:tcPr>
-            <w:tcW w:w="15554" w:type="dxa"/>
+            <w:tcW w:w="15555" w:type="dxa"/>
             <w:gridSpan w:val="6"/>
             <w:tcBorders>
               <w:top w:val="single" w:sz="4" w:space="0" w:color="000000"/>
@@ -128,7 +125,6 @@
                 <w:color w:val="000000"/>
                 <w:position w:val="0"/>
                 <w:sz w:val="24"/>
-                <w:sz w:val="24"/>
                 <w:szCs w:val="24"/>
                 <w:u w:val="none"/>
                 <w:shd w:fill="auto" w:val="clear"/>
@@ -175,7 +171,6 @@
                 <w:color w:val="000000"/>
                 <w:position w:val="0"/>
                 <w:sz w:val="24"/>
-                <w:sz w:val="24"/>
                 <w:szCs w:val="24"/>
                 <w:u w:val="none"/>
                 <w:shd w:fill="auto" w:val="clear"/>
@@ -194,7 +189,6 @@
                 <w:dstrike w:val="false"/>
                 <w:color w:val="000000"/>
                 <w:position w:val="0"/>
-                <w:sz w:val="24"/>
                 <w:sz w:val="24"/>
                 <w:szCs w:val="24"/>
                 <w:u w:val="single"/>
@@ -212,7 +206,7 @@
         </w:trPr>
         <w:tc>
           <w:tcPr>
-            <w:tcW w:w="1260" w:type="dxa"/>
+            <w:tcW w:w="1259" w:type="dxa"/>
             <w:tcBorders>
               <w:top w:val="single" w:sz="4" w:space="0" w:color="000000"/>
               <w:left w:val="single" w:sz="4" w:space="0" w:color="000000"/>
@@ -249,7 +243,6 @@
                 <w:color w:val="000000"/>
                 <w:position w:val="0"/>
                 <w:sz w:val="24"/>
-                <w:sz w:val="24"/>
                 <w:szCs w:val="24"/>
                 <w:u w:val="none"/>
                 <w:shd w:fill="auto" w:val="clear"/>
@@ -261,7 +254,7 @@
         </w:tc>
         <w:tc>
           <w:tcPr>
-            <w:tcW w:w="3359" w:type="dxa"/>
+            <w:tcW w:w="3360" w:type="dxa"/>
             <w:tcBorders>
               <w:top w:val="single" w:sz="4" w:space="0" w:color="000000"/>
               <w:left w:val="single" w:sz="4" w:space="0" w:color="000000"/>
@@ -298,7 +291,6 @@
                 <w:color w:val="000000"/>
                 <w:position w:val="0"/>
                 <w:sz w:val="24"/>
-                <w:sz w:val="24"/>
                 <w:szCs w:val="24"/>
                 <w:u w:val="none"/>
                 <w:shd w:fill="auto" w:val="clear"/>
@@ -347,7 +339,6 @@
                 <w:color w:val="000000"/>
                 <w:position w:val="0"/>
                 <w:sz w:val="24"/>
-                <w:sz w:val="24"/>
                 <w:szCs w:val="24"/>
                 <w:u w:val="none"/>
                 <w:shd w:fill="auto" w:val="clear"/>
@@ -396,7 +387,6 @@
                 <w:color w:val="000000"/>
                 <w:position w:val="0"/>
                 <w:sz w:val="24"/>
-                <w:sz w:val="24"/>
                 <w:szCs w:val="24"/>
                 <w:u w:val="none"/>
                 <w:shd w:fill="auto" w:val="clear"/>
@@ -445,7 +435,6 @@
                 <w:color w:val="000000"/>
                 <w:position w:val="0"/>
                 <w:sz w:val="24"/>
-                <w:sz w:val="24"/>
                 <w:szCs w:val="24"/>
                 <w:u w:val="none"/>
                 <w:shd w:fill="auto" w:val="clear"/>
@@ -457,7 +446,7 @@
         </w:tc>
         <w:tc>
           <w:tcPr>
-            <w:tcW w:w="2655" w:type="dxa"/>
+            <w:tcW w:w="2656" w:type="dxa"/>
             <w:tcBorders>
               <w:top w:val="single" w:sz="4" w:space="0" w:color="000000"/>
               <w:left w:val="single" w:sz="4" w:space="0" w:color="000000"/>
@@ -493,7 +482,6 @@
                 <w:dstrike w:val="false"/>
                 <w:color w:val="000000"/>
                 <w:position w:val="0"/>
-                <w:sz w:val="24"/>
                 <w:sz w:val="24"/>
                 <w:szCs w:val="24"/>
                 <w:u w:val="none"/>
@@ -511,7 +499,7 @@
         </w:trPr>
         <w:tc>
           <w:tcPr>
-            <w:tcW w:w="1260" w:type="dxa"/>
+            <w:tcW w:w="1259" w:type="dxa"/>
             <w:tcBorders>
               <w:top w:val="single" w:sz="4" w:space="0" w:color="000000"/>
               <w:left w:val="single" w:sz="4" w:space="0" w:color="000000"/>
@@ -533,14 +521,12 @@
                 <w:rFonts w:ascii="Arial" w:hAnsi="Arial" w:eastAsia="Times New Roman" w:cs="Times New Roman"/>
                 <w:b w:val="false"/>
                 <w:i w:val="false"/>
-                <w:i w:val="false"/>
-                <w:caps w:val="false"/>
-                <w:smallCaps w:val="false"/>
-                <w:strike w:val="false"/>
-                <w:dstrike w:val="false"/>
-                <w:color w:val="000000"/>
-                <w:position w:val="0"/>
-                <w:sz w:val="24"/>
+                <w:caps w:val="false"/>
+                <w:smallCaps w:val="false"/>
+                <w:strike w:val="false"/>
+                <w:dstrike w:val="false"/>
+                <w:color w:val="000000"/>
+                <w:position w:val="0"/>
                 <w:sz w:val="24"/>
                 <w:szCs w:val="24"/>
                 <w:u w:val="none"/>
@@ -559,7 +545,6 @@
                 <w:dstrike w:val="false"/>
                 <w:color w:val="000000"/>
                 <w:position w:val="0"/>
-                <w:sz w:val="24"/>
                 <w:sz w:val="24"/>
                 <w:szCs w:val="24"/>
                 <w:u w:val="none"/>
@@ -582,14 +567,12 @@
                 <w:rFonts w:ascii="Arial" w:hAnsi="Arial" w:eastAsia="Times New Roman" w:cs="Times New Roman"/>
                 <w:b w:val="false"/>
                 <w:i w:val="false"/>
-                <w:i w:val="false"/>
-                <w:caps w:val="false"/>
-                <w:smallCaps w:val="false"/>
-                <w:strike w:val="false"/>
-                <w:dstrike w:val="false"/>
-                <w:color w:val="000000"/>
-                <w:position w:val="0"/>
-                <w:sz w:val="24"/>
+                <w:caps w:val="false"/>
+                <w:smallCaps w:val="false"/>
+                <w:strike w:val="false"/>
+                <w:dstrike w:val="false"/>
+                <w:color w:val="000000"/>
+                <w:position w:val="0"/>
                 <w:sz w:val="24"/>
                 <w:szCs w:val="24"/>
                 <w:u w:val="none"/>
@@ -608,7 +591,6 @@
                 <w:dstrike w:val="false"/>
                 <w:color w:val="000000"/>
                 <w:position w:val="0"/>
-                <w:sz w:val="24"/>
                 <w:sz w:val="24"/>
                 <w:szCs w:val="24"/>
                 <w:u w:val="none"/>
@@ -646,7 +628,6 @@
                 <w:color w:val="000000"/>
                 <w:position w:val="0"/>
                 <w:sz w:val="24"/>
-                <w:sz w:val="24"/>
                 <w:szCs w:val="24"/>
                 <w:u w:val="none"/>
                 <w:shd w:fill="auto" w:val="clear"/>
@@ -658,7 +639,7 @@
         </w:tc>
         <w:tc>
           <w:tcPr>
-            <w:tcW w:w="3359" w:type="dxa"/>
+            <w:tcW w:w="3360" w:type="dxa"/>
             <w:tcBorders>
               <w:top w:val="single" w:sz="4" w:space="0" w:color="000000"/>
               <w:left w:val="single" w:sz="4" w:space="0" w:color="000000"/>
@@ -822,7 +803,7 @@
         </w:tc>
         <w:tc>
           <w:tcPr>
-            <w:tcW w:w="2655" w:type="dxa"/>
+            <w:tcW w:w="2656" w:type="dxa"/>
             <w:tcBorders>
               <w:top w:val="single" w:sz="4" w:space="0" w:color="000000"/>
               <w:left w:val="single" w:sz="4" w:space="0" w:color="000000"/>
@@ -863,7 +844,7 @@
         </w:trPr>
         <w:tc>
           <w:tcPr>
-            <w:tcW w:w="1260" w:type="dxa"/>
+            <w:tcW w:w="1259" w:type="dxa"/>
             <w:tcBorders>
               <w:top w:val="single" w:sz="4" w:space="0" w:color="000000"/>
               <w:left w:val="single" w:sz="4" w:space="0" w:color="000000"/>
@@ -885,14 +866,12 @@
                 <w:rFonts w:ascii="Arial" w:hAnsi="Arial" w:eastAsia="Times New Roman" w:cs="Times New Roman"/>
                 <w:b w:val="false"/>
                 <w:i w:val="false"/>
-                <w:i w:val="false"/>
-                <w:caps w:val="false"/>
-                <w:smallCaps w:val="false"/>
-                <w:strike w:val="false"/>
-                <w:dstrike w:val="false"/>
-                <w:color w:val="000000"/>
-                <w:position w:val="0"/>
-                <w:sz w:val="24"/>
+                <w:caps w:val="false"/>
+                <w:smallCaps w:val="false"/>
+                <w:strike w:val="false"/>
+                <w:dstrike w:val="false"/>
+                <w:color w:val="000000"/>
+                <w:position w:val="0"/>
                 <w:sz w:val="24"/>
                 <w:szCs w:val="24"/>
                 <w:u w:val="none"/>
@@ -912,18 +891,17 @@
                 <w:color w:val="000000"/>
                 <w:position w:val="0"/>
                 <w:sz w:val="24"/>
-                <w:sz w:val="24"/>
-                <w:szCs w:val="24"/>
-                <w:u w:val="none"/>
-                <w:shd w:fill="auto" w:val="clear"/>
-                <w:vertAlign w:val="baseline"/>
-              </w:rPr>
-            </w:r>
-          </w:p>
-        </w:tc>
-        <w:tc>
-          <w:tcPr>
-            <w:tcW w:w="3359" w:type="dxa"/>
+                <w:szCs w:val="24"/>
+                <w:u w:val="none"/>
+                <w:shd w:fill="auto" w:val="clear"/>
+                <w:vertAlign w:val="baseline"/>
+              </w:rPr>
+            </w:r>
+          </w:p>
+        </w:tc>
+        <w:tc>
+          <w:tcPr>
+            <w:tcW w:w="3360" w:type="dxa"/>
             <w:tcBorders>
               <w:top w:val="single" w:sz="4" w:space="0" w:color="000000"/>
               <w:left w:val="single" w:sz="4" w:space="0" w:color="000000"/>
@@ -945,14 +923,12 @@
                 <w:rFonts w:ascii="Arial" w:hAnsi="Arial" w:eastAsia="Times New Roman" w:cs="Times New Roman"/>
                 <w:b w:val="false"/>
                 <w:i w:val="false"/>
-                <w:i w:val="false"/>
-                <w:caps w:val="false"/>
-                <w:smallCaps w:val="false"/>
-                <w:strike w:val="false"/>
-                <w:dstrike w:val="false"/>
-                <w:color w:val="000000"/>
-                <w:position w:val="0"/>
-                <w:sz w:val="24"/>
+                <w:caps w:val="false"/>
+                <w:smallCaps w:val="false"/>
+                <w:strike w:val="false"/>
+                <w:dstrike w:val="false"/>
+                <w:color w:val="000000"/>
+                <w:position w:val="0"/>
                 <w:sz w:val="24"/>
                 <w:szCs w:val="24"/>
                 <w:u w:val="none"/>
@@ -971,7 +947,6 @@
                 <w:dstrike w:val="false"/>
                 <w:color w:val="000000"/>
                 <w:position w:val="0"/>
-                <w:sz w:val="24"/>
                 <w:sz w:val="24"/>
                 <w:szCs w:val="24"/>
                 <w:u w:val="none"/>
@@ -1039,14 +1014,12 @@
                 <w:rFonts w:ascii="Arial" w:hAnsi="Arial" w:eastAsia="Times New Roman" w:cs="Times New Roman"/>
                 <w:b w:val="false"/>
                 <w:i w:val="false"/>
-                <w:i w:val="false"/>
-                <w:caps w:val="false"/>
-                <w:smallCaps w:val="false"/>
-                <w:strike w:val="false"/>
-                <w:dstrike w:val="false"/>
-                <w:color w:val="000000"/>
-                <w:position w:val="0"/>
-                <w:sz w:val="24"/>
+                <w:caps w:val="false"/>
+                <w:smallCaps w:val="false"/>
+                <w:strike w:val="false"/>
+                <w:dstrike w:val="false"/>
+                <w:color w:val="000000"/>
+                <w:position w:val="0"/>
                 <w:sz w:val="24"/>
                 <w:szCs w:val="24"/>
                 <w:u w:val="none"/>
@@ -1065,7 +1038,6 @@
                 <w:dstrike w:val="false"/>
                 <w:color w:val="000000"/>
                 <w:position w:val="0"/>
-                <w:sz w:val="24"/>
                 <w:sz w:val="24"/>
                 <w:szCs w:val="24"/>
                 <w:u w:val="none"/>
@@ -1088,14 +1060,12 @@
                 <w:rFonts w:ascii="Arial" w:hAnsi="Arial" w:eastAsia="Times New Roman" w:cs="Times New Roman"/>
                 <w:b w:val="false"/>
                 <w:i w:val="false"/>
-                <w:i w:val="false"/>
-                <w:caps w:val="false"/>
-                <w:smallCaps w:val="false"/>
-                <w:strike w:val="false"/>
-                <w:dstrike w:val="false"/>
-                <w:color w:val="000000"/>
-                <w:position w:val="0"/>
-                <w:sz w:val="24"/>
+                <w:caps w:val="false"/>
+                <w:smallCaps w:val="false"/>
+                <w:strike w:val="false"/>
+                <w:dstrike w:val="false"/>
+                <w:color w:val="000000"/>
+                <w:position w:val="0"/>
                 <w:sz w:val="24"/>
                 <w:szCs w:val="24"/>
                 <w:u w:val="none"/>
@@ -1114,7 +1084,6 @@
                 <w:dstrike w:val="false"/>
                 <w:color w:val="000000"/>
                 <w:position w:val="0"/>
-                <w:sz w:val="24"/>
                 <w:sz w:val="24"/>
                 <w:szCs w:val="24"/>
                 <w:u w:val="none"/>
@@ -1182,14 +1151,12 @@
                 <w:rFonts w:ascii="Arial" w:hAnsi="Arial" w:eastAsia="Times New Roman" w:cs="Times New Roman"/>
                 <w:b w:val="false"/>
                 <w:i w:val="false"/>
-                <w:i w:val="false"/>
-                <w:caps w:val="false"/>
-                <w:smallCaps w:val="false"/>
-                <w:strike w:val="false"/>
-                <w:dstrike w:val="false"/>
-                <w:color w:val="000000"/>
-                <w:position w:val="0"/>
-                <w:sz w:val="24"/>
+                <w:caps w:val="false"/>
+                <w:smallCaps w:val="false"/>
+                <w:strike w:val="false"/>
+                <w:dstrike w:val="false"/>
+                <w:color w:val="000000"/>
+                <w:position w:val="0"/>
                 <w:sz w:val="24"/>
                 <w:szCs w:val="24"/>
                 <w:u w:val="none"/>
@@ -1208,7 +1175,6 @@
                 <w:dstrike w:val="false"/>
                 <w:color w:val="000000"/>
                 <w:position w:val="0"/>
-                <w:sz w:val="24"/>
                 <w:sz w:val="24"/>
                 <w:szCs w:val="24"/>
                 <w:u w:val="none"/>
@@ -1276,14 +1242,12 @@
                 <w:rFonts w:ascii="Arial" w:hAnsi="Arial" w:eastAsia="Times New Roman" w:cs="Times New Roman"/>
                 <w:b w:val="false"/>
                 <w:i w:val="false"/>
-                <w:i w:val="false"/>
-                <w:caps w:val="false"/>
-                <w:smallCaps w:val="false"/>
-                <w:strike w:val="false"/>
-                <w:dstrike w:val="false"/>
-                <w:color w:val="000000"/>
-                <w:position w:val="0"/>
-                <w:sz w:val="24"/>
+                <w:caps w:val="false"/>
+                <w:smallCaps w:val="false"/>
+                <w:strike w:val="false"/>
+                <w:dstrike w:val="false"/>
+                <w:color w:val="000000"/>
+                <w:position w:val="0"/>
                 <w:sz w:val="24"/>
                 <w:szCs w:val="24"/>
                 <w:u w:val="none"/>
@@ -1302,7 +1266,6 @@
                 <w:dstrike w:val="false"/>
                 <w:color w:val="000000"/>
                 <w:position w:val="0"/>
-                <w:sz w:val="24"/>
                 <w:sz w:val="24"/>
                 <w:szCs w:val="24"/>
                 <w:u w:val="none"/>
@@ -1358,7 +1321,7 @@
         </w:tc>
         <w:tc>
           <w:tcPr>
-            <w:tcW w:w="2655" w:type="dxa"/>
+            <w:tcW w:w="2656" w:type="dxa"/>
             <w:tcBorders>
               <w:top w:val="single" w:sz="4" w:space="0" w:color="000000"/>
               <w:left w:val="single" w:sz="4" w:space="0" w:color="000000"/>
@@ -1436,7 +1399,7 @@
         </w:trPr>
         <w:tc>
           <w:tcPr>
-            <w:tcW w:w="1260" w:type="dxa"/>
+            <w:tcW w:w="1259" w:type="dxa"/>
             <w:tcBorders>
               <w:top w:val="single" w:sz="4" w:space="0" w:color="000000"/>
               <w:left w:val="single" w:sz="4" w:space="0" w:color="000000"/>
@@ -1458,14 +1421,12 @@
                 <w:rFonts w:ascii="Arial" w:hAnsi="Arial" w:eastAsia="Times New Roman" w:cs="Times New Roman"/>
                 <w:b w:val="false"/>
                 <w:i w:val="false"/>
-                <w:i w:val="false"/>
-                <w:caps w:val="false"/>
-                <w:smallCaps w:val="false"/>
-                <w:strike w:val="false"/>
-                <w:dstrike w:val="false"/>
-                <w:color w:val="000000"/>
-                <w:position w:val="0"/>
-                <w:sz w:val="24"/>
+                <w:caps w:val="false"/>
+                <w:smallCaps w:val="false"/>
+                <w:strike w:val="false"/>
+                <w:dstrike w:val="false"/>
+                <w:color w:val="000000"/>
+                <w:position w:val="0"/>
                 <w:sz w:val="24"/>
                 <w:szCs w:val="24"/>
                 <w:u w:val="none"/>
@@ -1485,18 +1446,17 @@
                 <w:color w:val="000000"/>
                 <w:position w:val="0"/>
                 <w:sz w:val="24"/>
-                <w:sz w:val="24"/>
-                <w:szCs w:val="24"/>
-                <w:u w:val="none"/>
-                <w:shd w:fill="auto" w:val="clear"/>
-                <w:vertAlign w:val="baseline"/>
-              </w:rPr>
-            </w:r>
-          </w:p>
-        </w:tc>
-        <w:tc>
-          <w:tcPr>
-            <w:tcW w:w="3359" w:type="dxa"/>
+                <w:szCs w:val="24"/>
+                <w:u w:val="none"/>
+                <w:shd w:fill="auto" w:val="clear"/>
+                <w:vertAlign w:val="baseline"/>
+              </w:rPr>
+            </w:r>
+          </w:p>
+        </w:tc>
+        <w:tc>
+          <w:tcPr>
+            <w:tcW w:w="3360" w:type="dxa"/>
             <w:tcBorders>
               <w:top w:val="single" w:sz="4" w:space="0" w:color="000000"/>
               <w:left w:val="single" w:sz="4" w:space="0" w:color="000000"/>
@@ -1518,14 +1478,12 @@
                 <w:rFonts w:ascii="Arial" w:hAnsi="Arial" w:eastAsia="Times New Roman" w:cs="Times New Roman"/>
                 <w:b w:val="false"/>
                 <w:i w:val="false"/>
-                <w:i w:val="false"/>
-                <w:caps w:val="false"/>
-                <w:smallCaps w:val="false"/>
-                <w:strike w:val="false"/>
-                <w:dstrike w:val="false"/>
-                <w:color w:val="000000"/>
-                <w:position w:val="0"/>
-                <w:sz w:val="24"/>
+                <w:caps w:val="false"/>
+                <w:smallCaps w:val="false"/>
+                <w:strike w:val="false"/>
+                <w:dstrike w:val="false"/>
+                <w:color w:val="000000"/>
+                <w:position w:val="0"/>
                 <w:sz w:val="24"/>
                 <w:szCs w:val="24"/>
                 <w:u w:val="none"/>
@@ -1544,7 +1502,6 @@
                 <w:dstrike w:val="false"/>
                 <w:color w:val="000000"/>
                 <w:position w:val="0"/>
-                <w:sz w:val="24"/>
                 <w:sz w:val="24"/>
                 <w:szCs w:val="24"/>
                 <w:u w:val="none"/>
@@ -1567,14 +1524,12 @@
                 <w:rFonts w:ascii="Arial" w:hAnsi="Arial" w:eastAsia="Times New Roman" w:cs="Times New Roman"/>
                 <w:b w:val="false"/>
                 <w:i w:val="false"/>
-                <w:i w:val="false"/>
-                <w:caps w:val="false"/>
-                <w:smallCaps w:val="false"/>
-                <w:strike w:val="false"/>
-                <w:dstrike w:val="false"/>
-                <w:color w:val="000000"/>
-                <w:position w:val="0"/>
-                <w:sz w:val="24"/>
+                <w:caps w:val="false"/>
+                <w:smallCaps w:val="false"/>
+                <w:strike w:val="false"/>
+                <w:dstrike w:val="false"/>
+                <w:color w:val="000000"/>
+                <w:position w:val="0"/>
                 <w:sz w:val="24"/>
                 <w:szCs w:val="24"/>
                 <w:u w:val="none"/>
@@ -1593,7 +1548,6 @@
                 <w:dstrike w:val="false"/>
                 <w:color w:val="000000"/>
                 <w:position w:val="0"/>
-                <w:sz w:val="24"/>
                 <w:sz w:val="24"/>
                 <w:szCs w:val="24"/>
                 <w:u w:val="none"/>
@@ -1661,14 +1615,12 @@
                 <w:rFonts w:ascii="Arial" w:hAnsi="Arial" w:eastAsia="Times New Roman" w:cs="Times New Roman"/>
                 <w:b w:val="false"/>
                 <w:i w:val="false"/>
-                <w:i w:val="false"/>
-                <w:caps w:val="false"/>
-                <w:smallCaps w:val="false"/>
-                <w:strike w:val="false"/>
-                <w:dstrike w:val="false"/>
-                <w:color w:val="000000"/>
-                <w:position w:val="0"/>
-                <w:sz w:val="24"/>
+                <w:caps w:val="false"/>
+                <w:smallCaps w:val="false"/>
+                <w:strike w:val="false"/>
+                <w:dstrike w:val="false"/>
+                <w:color w:val="000000"/>
+                <w:position w:val="0"/>
                 <w:sz w:val="24"/>
                 <w:szCs w:val="24"/>
                 <w:u w:val="none"/>
@@ -1687,7 +1639,6 @@
                 <w:dstrike w:val="false"/>
                 <w:color w:val="000000"/>
                 <w:position w:val="0"/>
-                <w:sz w:val="24"/>
                 <w:sz w:val="24"/>
                 <w:szCs w:val="24"/>
                 <w:u w:val="none"/>
@@ -1710,14 +1661,12 @@
                 <w:rFonts w:ascii="Arial" w:hAnsi="Arial" w:eastAsia="Times New Roman" w:cs="Times New Roman"/>
                 <w:b w:val="false"/>
                 <w:i w:val="false"/>
-                <w:i w:val="false"/>
-                <w:caps w:val="false"/>
-                <w:smallCaps w:val="false"/>
-                <w:strike w:val="false"/>
-                <w:dstrike w:val="false"/>
-                <w:color w:val="000000"/>
-                <w:position w:val="0"/>
-                <w:sz w:val="24"/>
+                <w:caps w:val="false"/>
+                <w:smallCaps w:val="false"/>
+                <w:strike w:val="false"/>
+                <w:dstrike w:val="false"/>
+                <w:color w:val="000000"/>
+                <w:position w:val="0"/>
                 <w:sz w:val="24"/>
                 <w:szCs w:val="24"/>
                 <w:u w:val="none"/>
@@ -1736,7 +1685,6 @@
                 <w:dstrike w:val="false"/>
                 <w:color w:val="000000"/>
                 <w:position w:val="0"/>
-                <w:sz w:val="24"/>
                 <w:sz w:val="24"/>
                 <w:szCs w:val="24"/>
                 <w:u w:val="none"/>
@@ -1882,14 +1830,12 @@
                 <w:rFonts w:ascii="Arial" w:hAnsi="Arial" w:eastAsia="Times New Roman" w:cs="Times New Roman"/>
                 <w:b w:val="false"/>
                 <w:i w:val="false"/>
-                <w:i w:val="false"/>
-                <w:caps w:val="false"/>
-                <w:smallCaps w:val="false"/>
-                <w:strike w:val="false"/>
-                <w:dstrike w:val="false"/>
-                <w:color w:val="000000"/>
-                <w:position w:val="0"/>
-                <w:sz w:val="24"/>
+                <w:caps w:val="false"/>
+                <w:smallCaps w:val="false"/>
+                <w:strike w:val="false"/>
+                <w:dstrike w:val="false"/>
+                <w:color w:val="000000"/>
+                <w:position w:val="0"/>
                 <w:sz w:val="24"/>
                 <w:szCs w:val="24"/>
                 <w:u w:val="none"/>
@@ -1908,7 +1854,6 @@
                 <w:dstrike w:val="false"/>
                 <w:color w:val="000000"/>
                 <w:position w:val="0"/>
-                <w:sz w:val="24"/>
                 <w:sz w:val="24"/>
                 <w:szCs w:val="24"/>
                 <w:u w:val="none"/>
@@ -1978,7 +1923,7 @@
         </w:tc>
         <w:tc>
           <w:tcPr>
-            <w:tcW w:w="2655" w:type="dxa"/>
+            <w:tcW w:w="2656" w:type="dxa"/>
             <w:tcBorders>
               <w:top w:val="single" w:sz="4" w:space="0" w:color="000000"/>
               <w:left w:val="single" w:sz="4" w:space="0" w:color="000000"/>
@@ -2111,12 +2056,12 @@
         <w:tblLook w:val="0000"/>
       </w:tblPr>
       <w:tblGrid>
-        <w:gridCol w:w="1284"/>
-        <w:gridCol w:w="3329"/>
+        <w:gridCol w:w="1905"/>
+        <w:gridCol w:w="2708"/>
         <w:gridCol w:w="2881"/>
         <w:gridCol w:w="2615"/>
         <w:gridCol w:w="2788"/>
-        <w:gridCol w:w="2651"/>
+        <w:gridCol w:w="2652"/>
       </w:tblGrid>
       <w:tr>
         <w:trPr>
@@ -2124,7 +2069,7 @@
         </w:trPr>
         <w:tc>
           <w:tcPr>
-            <w:tcW w:w="1284" w:type="dxa"/>
+            <w:tcW w:w="1905" w:type="dxa"/>
             <w:tcBorders>
               <w:left w:val="single" w:sz="4" w:space="0" w:color="000000"/>
               <w:bottom w:val="single" w:sz="4" w:space="0" w:color="000000"/>
@@ -2145,14 +2090,12 @@
                 <w:rFonts w:ascii="Arial" w:hAnsi="Arial" w:eastAsia="Times New Roman" w:cs="Times New Roman"/>
                 <w:b w:val="false"/>
                 <w:i w:val="false"/>
-                <w:i w:val="false"/>
-                <w:caps w:val="false"/>
-                <w:smallCaps w:val="false"/>
-                <w:strike w:val="false"/>
-                <w:dstrike w:val="false"/>
-                <w:color w:val="000000"/>
-                <w:position w:val="0"/>
-                <w:sz w:val="24"/>
+                <w:caps w:val="false"/>
+                <w:smallCaps w:val="false"/>
+                <w:strike w:val="false"/>
+                <w:dstrike w:val="false"/>
+                <w:color w:val="000000"/>
+                <w:position w:val="0"/>
                 <w:sz w:val="24"/>
                 <w:szCs w:val="24"/>
                 <w:u w:val="none"/>
@@ -2172,18 +2115,17 @@
                 <w:color w:val="000000"/>
                 <w:position w:val="0"/>
                 <w:sz w:val="24"/>
-                <w:sz w:val="24"/>
-                <w:szCs w:val="24"/>
-                <w:u w:val="none"/>
-                <w:shd w:fill="auto" w:val="clear"/>
-                <w:vertAlign w:val="baseline"/>
-              </w:rPr>
-            </w:r>
-          </w:p>
-        </w:tc>
-        <w:tc>
-          <w:tcPr>
-            <w:tcW w:w="3329" w:type="dxa"/>
+                <w:szCs w:val="24"/>
+                <w:u w:val="none"/>
+                <w:shd w:fill="auto" w:val="clear"/>
+                <w:vertAlign w:val="baseline"/>
+              </w:rPr>
+            </w:r>
+          </w:p>
+        </w:tc>
+        <w:tc>
+          <w:tcPr>
+            <w:tcW w:w="2708" w:type="dxa"/>
             <w:tcBorders>
               <w:left w:val="single" w:sz="4" w:space="0" w:color="000000"/>
               <w:bottom w:val="single" w:sz="4" w:space="0" w:color="000000"/>
@@ -2271,14 +2213,12 @@
                 <w:rFonts w:ascii="Arial" w:hAnsi="Arial" w:eastAsia="Times New Roman" w:cs="Times New Roman"/>
                 <w:b w:val="false"/>
                 <w:i w:val="false"/>
-                <w:i w:val="false"/>
-                <w:caps w:val="false"/>
-                <w:smallCaps w:val="false"/>
-                <w:strike w:val="false"/>
-                <w:dstrike w:val="false"/>
-                <w:color w:val="000000"/>
-                <w:position w:val="0"/>
-                <w:sz w:val="24"/>
+                <w:caps w:val="false"/>
+                <w:smallCaps w:val="false"/>
+                <w:strike w:val="false"/>
+                <w:dstrike w:val="false"/>
+                <w:color w:val="000000"/>
+                <w:position w:val="0"/>
                 <w:sz w:val="24"/>
                 <w:szCs w:val="24"/>
                 <w:u w:val="none"/>
@@ -2297,7 +2237,6 @@
                 <w:dstrike w:val="false"/>
                 <w:color w:val="000000"/>
                 <w:position w:val="0"/>
-                <w:sz w:val="24"/>
                 <w:sz w:val="24"/>
                 <w:szCs w:val="24"/>
                 <w:u w:val="none"/>
@@ -2364,14 +2303,12 @@
                 <w:rFonts w:ascii="Arial" w:hAnsi="Arial" w:eastAsia="Arial" w:cs="Arial"/>
                 <w:b/>
                 <w:i w:val="false"/>
-                <w:i w:val="false"/>
-                <w:caps w:val="false"/>
-                <w:smallCaps w:val="false"/>
-                <w:strike w:val="false"/>
-                <w:dstrike w:val="false"/>
-                <w:color w:val="000000"/>
-                <w:position w:val="0"/>
-                <w:sz w:val="24"/>
+                <w:caps w:val="false"/>
+                <w:smallCaps w:val="false"/>
+                <w:strike w:val="false"/>
+                <w:dstrike w:val="false"/>
+                <w:color w:val="000000"/>
+                <w:position w:val="0"/>
                 <w:sz w:val="24"/>
                 <w:szCs w:val="24"/>
                 <w:u w:val="none"/>
@@ -2390,7 +2327,6 @@
                 <w:dstrike w:val="false"/>
                 <w:color w:val="000000"/>
                 <w:position w:val="0"/>
-                <w:sz w:val="24"/>
                 <w:sz w:val="24"/>
                 <w:szCs w:val="24"/>
                 <w:u w:val="none"/>
@@ -2426,7 +2362,6 @@
                 <w:color w:val="000000"/>
                 <w:position w:val="0"/>
                 <w:sz w:val="24"/>
-                <w:sz w:val="24"/>
                 <w:szCs w:val="24"/>
                 <w:u w:val="none"/>
                 <w:shd w:fill="auto" w:val="clear"/>
@@ -2446,7 +2381,6 @@
                 <w:dstrike w:val="false"/>
                 <w:color w:val="000000"/>
                 <w:position w:val="0"/>
-                <w:sz w:val="24"/>
                 <w:sz w:val="24"/>
                 <w:szCs w:val="24"/>
                 <w:u w:val="none"/>
@@ -2490,14 +2424,12 @@
                 <w:rFonts w:ascii="Arial" w:hAnsi="Arial" w:eastAsia="Arial" w:cs="Arial"/>
                 <w:b/>
                 <w:i w:val="false"/>
-                <w:i w:val="false"/>
-                <w:caps w:val="false"/>
-                <w:smallCaps w:val="false"/>
-                <w:strike w:val="false"/>
-                <w:dstrike w:val="false"/>
-                <w:color w:val="000000"/>
-                <w:position w:val="0"/>
-                <w:sz w:val="24"/>
+                <w:caps w:val="false"/>
+                <w:smallCaps w:val="false"/>
+                <w:strike w:val="false"/>
+                <w:dstrike w:val="false"/>
+                <w:color w:val="000000"/>
+                <w:position w:val="0"/>
                 <w:sz w:val="24"/>
                 <w:szCs w:val="24"/>
                 <w:u w:val="none"/>
@@ -2516,7 +2448,6 @@
                 <w:dstrike w:val="false"/>
                 <w:color w:val="000000"/>
                 <w:position w:val="0"/>
-                <w:sz w:val="24"/>
                 <w:sz w:val="24"/>
                 <w:szCs w:val="24"/>
                 <w:u w:val="none"/>
@@ -2552,7 +2483,6 @@
                 <w:color w:val="000000"/>
                 <w:position w:val="0"/>
                 <w:sz w:val="24"/>
-                <w:sz w:val="24"/>
                 <w:szCs w:val="24"/>
                 <w:u w:val="none"/>
                 <w:shd w:fill="auto" w:val="clear"/>
@@ -2595,7 +2525,7 @@
         </w:tc>
         <w:tc>
           <w:tcPr>
-            <w:tcW w:w="2651" w:type="dxa"/>
+            <w:tcW w:w="2652" w:type="dxa"/>
             <w:tcBorders>
               <w:left w:val="single" w:sz="4" w:space="0" w:color="000000"/>
               <w:bottom w:val="single" w:sz="4" w:space="0" w:color="000000"/>
@@ -2616,14 +2546,12 @@
                 <w:rFonts w:ascii="Arial" w:hAnsi="Arial" w:eastAsia="Times New Roman" w:cs="Times New Roman"/>
                 <w:b w:val="false"/>
                 <w:i w:val="false"/>
-                <w:i w:val="false"/>
-                <w:caps w:val="false"/>
-                <w:smallCaps w:val="false"/>
-                <w:strike w:val="false"/>
-                <w:dstrike w:val="false"/>
-                <w:color w:val="000000"/>
-                <w:position w:val="0"/>
-                <w:sz w:val="24"/>
+                <w:caps w:val="false"/>
+                <w:smallCaps w:val="false"/>
+                <w:strike w:val="false"/>
+                <w:dstrike w:val="false"/>
+                <w:color w:val="000000"/>
+                <w:position w:val="0"/>
                 <w:sz w:val="24"/>
                 <w:szCs w:val="24"/>
                 <w:u w:val="none"/>
@@ -2642,7 +2570,6 @@
                 <w:dstrike w:val="false"/>
                 <w:color w:val="000000"/>
                 <w:position w:val="0"/>
-                <w:sz w:val="24"/>
                 <w:sz w:val="24"/>
                 <w:szCs w:val="24"/>
                 <w:u w:val="none"/>
@@ -2693,7 +2620,7 @@
         </w:trPr>
         <w:tc>
           <w:tcPr>
-            <w:tcW w:w="1284" w:type="dxa"/>
+            <w:tcW w:w="1905" w:type="dxa"/>
             <w:tcBorders>
               <w:top w:val="single" w:sz="4" w:space="0" w:color="000000"/>
               <w:left w:val="single" w:sz="4" w:space="0" w:color="000000"/>
@@ -2726,13 +2653,43 @@
                 <w:sz w:val="24"/>
                 <w:szCs w:val="24"/>
               </w:rPr>
-              <w:t>14H às 14:20</w:t>
-            </w:r>
-          </w:p>
-        </w:tc>
-        <w:tc>
-          <w:tcPr>
-            <w:tcW w:w="3329" w:type="dxa"/>
+              <w:t>1</w:t>
+            </w:r>
+            <w:r>
+              <w:rPr>
+                <w:rFonts w:ascii="Arial" w:hAnsi="Arial"/>
+                <w:b/>
+                <w:color w:val="000000"/>
+                <w:sz w:val="24"/>
+                <w:szCs w:val="24"/>
+              </w:rPr>
+              <w:t>3:45</w:t>
+            </w:r>
+            <w:r>
+              <w:rPr>
+                <w:rFonts w:ascii="Arial" w:hAnsi="Arial"/>
+                <w:b/>
+                <w:color w:val="000000"/>
+                <w:sz w:val="24"/>
+                <w:szCs w:val="24"/>
+              </w:rPr>
+              <w:t>H às 14:</w:t>
+            </w:r>
+            <w:r>
+              <w:rPr>
+                <w:rFonts w:ascii="Arial" w:hAnsi="Arial"/>
+                <w:b/>
+                <w:color w:val="000000"/>
+                <w:sz w:val="24"/>
+                <w:szCs w:val="24"/>
+              </w:rPr>
+              <w:t>00</w:t>
+            </w:r>
+          </w:p>
+        </w:tc>
+        <w:tc>
+          <w:tcPr>
+            <w:tcW w:w="2708" w:type="dxa"/>
             <w:tcBorders>
               <w:top w:val="single" w:sz="4" w:space="0" w:color="000000"/>
               <w:left w:val="single" w:sz="4" w:space="0" w:color="000000"/>
@@ -2769,7 +2726,6 @@
                 <w:color w:val="000000"/>
                 <w:position w:val="0"/>
                 <w:sz w:val="24"/>
-                <w:sz w:val="24"/>
                 <w:szCs w:val="24"/>
                 <w:u w:val="none"/>
                 <w:shd w:fill="auto" w:val="clear"/>
@@ -2818,7 +2774,6 @@
                 <w:color w:val="000000"/>
                 <w:position w:val="0"/>
                 <w:sz w:val="24"/>
-                <w:sz w:val="24"/>
                 <w:szCs w:val="24"/>
                 <w:u w:val="none"/>
                 <w:shd w:fill="auto" w:val="clear"/>
@@ -2867,7 +2822,6 @@
                 <w:color w:val="000000"/>
                 <w:position w:val="0"/>
                 <w:sz w:val="24"/>
-                <w:sz w:val="24"/>
                 <w:szCs w:val="24"/>
                 <w:u w:val="none"/>
                 <w:shd w:fill="auto" w:val="clear"/>
@@ -2916,7 +2870,6 @@
                 <w:color w:val="000000"/>
                 <w:position w:val="0"/>
                 <w:sz w:val="24"/>
-                <w:sz w:val="24"/>
                 <w:szCs w:val="24"/>
                 <w:u w:val="none"/>
                 <w:shd w:fill="auto" w:val="clear"/>
@@ -2928,7 +2881,7 @@
         </w:tc>
         <w:tc>
           <w:tcPr>
-            <w:tcW w:w="2651" w:type="dxa"/>
+            <w:tcW w:w="2652" w:type="dxa"/>
             <w:tcBorders>
               <w:top w:val="single" w:sz="4" w:space="0" w:color="000000"/>
               <w:left w:val="single" w:sz="4" w:space="0" w:color="000000"/>
@@ -2964,7 +2917,6 @@
                 <w:dstrike w:val="false"/>
                 <w:color w:val="000000"/>
                 <w:position w:val="0"/>
-                <w:sz w:val="24"/>
                 <w:sz w:val="24"/>
                 <w:szCs w:val="24"/>
                 <w:u w:val="none"/>
@@ -2980,7 +2932,7 @@
         <w:trPr/>
         <w:tc>
           <w:tcPr>
-            <w:tcW w:w="1284" w:type="dxa"/>
+            <w:tcW w:w="1905" w:type="dxa"/>
             <w:tcBorders>
               <w:top w:val="single" w:sz="4" w:space="0" w:color="000000"/>
               <w:left w:val="single" w:sz="4" w:space="0" w:color="000000"/>
@@ -3009,13 +2961,37 @@
                 <w:sz w:val="24"/>
                 <w:szCs w:val="24"/>
               </w:rPr>
-              <w:t>13H00 ate as 13h20</w:t>
-            </w:r>
-          </w:p>
-        </w:tc>
-        <w:tc>
-          <w:tcPr>
-            <w:tcW w:w="3329" w:type="dxa"/>
+            </w:r>
+          </w:p>
+          <w:p>
+            <w:pPr>
+              <w:pStyle w:val="normal1"/>
+              <w:spacing w:lineRule="auto" w:line="209"/>
+              <w:ind w:hanging="0" w:left="172" w:right="168"/>
+              <w:jc w:val="center"/>
+              <w:rPr>
+                <w:rFonts w:ascii="Arial" w:hAnsi="Arial"/>
+                <w:color w:val="000000"/>
+                <w:sz w:val="24"/>
+                <w:szCs w:val="24"/>
+              </w:rPr>
+            </w:pPr>
+            <w:r>
+              <w:rPr>
+                <w:rFonts w:ascii="Arial" w:hAnsi="Arial"/>
+                <w:b/>
+                <w:color w:val="000000"/>
+                <w:sz w:val="24"/>
+                <w:szCs w:val="24"/>
+              </w:rPr>
+              <w:t>13:00 - 13:45</w:t>
+              <w:br/>
+            </w:r>
+          </w:p>
+        </w:tc>
+        <w:tc>
+          <w:tcPr>
+            <w:tcW w:w="2708" w:type="dxa"/>
             <w:tcBorders>
               <w:top w:val="single" w:sz="4" w:space="0" w:color="000000"/>
               <w:left w:val="single" w:sz="4" w:space="0" w:color="000000"/>
@@ -3052,7 +3028,6 @@
                 <w:color w:val="000000"/>
                 <w:position w:val="0"/>
                 <w:sz w:val="24"/>
-                <w:sz w:val="24"/>
                 <w:szCs w:val="24"/>
                 <w:u w:val="none"/>
                 <w:shd w:fill="auto" w:val="clear"/>
@@ -3086,14 +3061,12 @@
                 <w:rFonts w:ascii="Arial" w:hAnsi="Arial" w:eastAsia="Times New Roman" w:cs="Times New Roman"/>
                 <w:b w:val="false"/>
                 <w:i w:val="false"/>
-                <w:i w:val="false"/>
-                <w:caps w:val="false"/>
-                <w:smallCaps w:val="false"/>
-                <w:strike w:val="false"/>
-                <w:dstrike w:val="false"/>
-                <w:color w:val="000000"/>
-                <w:position w:val="0"/>
-                <w:sz w:val="24"/>
+                <w:caps w:val="false"/>
+                <w:smallCaps w:val="false"/>
+                <w:strike w:val="false"/>
+                <w:dstrike w:val="false"/>
+                <w:color w:val="000000"/>
+                <w:position w:val="0"/>
                 <w:sz w:val="24"/>
                 <w:szCs w:val="24"/>
                 <w:u w:val="none"/>
@@ -3112,7 +3085,6 @@
                 <w:dstrike w:val="false"/>
                 <w:color w:val="000000"/>
                 <w:position w:val="0"/>
-                <w:sz w:val="24"/>
                 <w:sz w:val="24"/>
                 <w:szCs w:val="24"/>
                 <w:u w:val="none"/>
@@ -3150,7 +3122,6 @@
                 <w:color w:val="000000"/>
                 <w:position w:val="0"/>
                 <w:sz w:val="24"/>
-                <w:sz w:val="24"/>
                 <w:szCs w:val="24"/>
                 <w:u w:val="none"/>
                 <w:shd w:fill="auto" w:val="clear"/>
@@ -3184,14 +3155,12 @@
                 <w:rFonts w:ascii="Arial" w:hAnsi="Arial" w:eastAsia="Times New Roman" w:cs="Times New Roman"/>
                 <w:b w:val="false"/>
                 <w:i w:val="false"/>
-                <w:i w:val="false"/>
-                <w:caps w:val="false"/>
-                <w:smallCaps w:val="false"/>
-                <w:strike w:val="false"/>
-                <w:dstrike w:val="false"/>
-                <w:color w:val="000000"/>
-                <w:position w:val="0"/>
-                <w:sz w:val="24"/>
+                <w:caps w:val="false"/>
+                <w:smallCaps w:val="false"/>
+                <w:strike w:val="false"/>
+                <w:dstrike w:val="false"/>
+                <w:color w:val="000000"/>
+                <w:position w:val="0"/>
                 <w:sz w:val="24"/>
                 <w:szCs w:val="24"/>
                 <w:u w:val="none"/>
@@ -3210,7 +3179,6 @@
                 <w:dstrike w:val="false"/>
                 <w:color w:val="000000"/>
                 <w:position w:val="0"/>
-                <w:sz w:val="24"/>
                 <w:sz w:val="24"/>
                 <w:szCs w:val="24"/>
                 <w:u w:val="none"/>
@@ -3248,7 +3216,6 @@
                 <w:color w:val="000000"/>
                 <w:position w:val="0"/>
                 <w:sz w:val="24"/>
-                <w:sz w:val="24"/>
                 <w:szCs w:val="24"/>
                 <w:u w:val="none"/>
                 <w:shd w:fill="auto" w:val="clear"/>
@@ -3282,14 +3249,12 @@
                 <w:rFonts w:ascii="Arial" w:hAnsi="Arial" w:eastAsia="Times New Roman" w:cs="Times New Roman"/>
                 <w:b w:val="false"/>
                 <w:i w:val="false"/>
-                <w:i w:val="false"/>
-                <w:caps w:val="false"/>
-                <w:smallCaps w:val="false"/>
-                <w:strike w:val="false"/>
-                <w:dstrike w:val="false"/>
-                <w:color w:val="000000"/>
-                <w:position w:val="0"/>
-                <w:sz w:val="24"/>
+                <w:caps w:val="false"/>
+                <w:smallCaps w:val="false"/>
+                <w:strike w:val="false"/>
+                <w:dstrike w:val="false"/>
+                <w:color w:val="000000"/>
+                <w:position w:val="0"/>
                 <w:sz w:val="24"/>
                 <w:szCs w:val="24"/>
                 <w:u w:val="none"/>
@@ -3308,7 +3273,6 @@
                 <w:dstrike w:val="false"/>
                 <w:color w:val="000000"/>
                 <w:position w:val="0"/>
-                <w:sz w:val="24"/>
                 <w:sz w:val="24"/>
                 <w:szCs w:val="24"/>
                 <w:u w:val="none"/>
@@ -3346,7 +3310,6 @@
                 <w:color w:val="000000"/>
                 <w:position w:val="0"/>
                 <w:sz w:val="24"/>
-                <w:sz w:val="24"/>
                 <w:szCs w:val="24"/>
                 <w:u w:val="none"/>
                 <w:shd w:fill="auto" w:val="clear"/>
@@ -3384,7 +3347,6 @@
                 <w:color w:val="000000"/>
                 <w:position w:val="0"/>
                 <w:sz w:val="24"/>
-                <w:sz w:val="24"/>
                 <w:szCs w:val="24"/>
                 <w:u w:val="none"/>
                 <w:shd w:fill="auto" w:val="clear"/>
@@ -3422,7 +3384,6 @@
                 <w:color w:val="000000"/>
                 <w:position w:val="0"/>
                 <w:sz w:val="24"/>
-                <w:sz w:val="24"/>
                 <w:szCs w:val="24"/>
                 <w:u w:val="none"/>
                 <w:shd w:fill="auto" w:val="clear"/>
@@ -3434,7 +3395,7 @@
         </w:tc>
         <w:tc>
           <w:tcPr>
-            <w:tcW w:w="2651" w:type="dxa"/>
+            <w:tcW w:w="2652" w:type="dxa"/>
             <w:tcBorders>
               <w:top w:val="single" w:sz="4" w:space="0" w:color="000000"/>
               <w:left w:val="single" w:sz="4" w:space="0" w:color="000000"/>
@@ -3456,14 +3417,12 @@
                 <w:rFonts w:ascii="Arial" w:hAnsi="Arial" w:eastAsia="Times New Roman" w:cs="Times New Roman"/>
                 <w:b w:val="false"/>
                 <w:i w:val="false"/>
-                <w:i w:val="false"/>
-                <w:caps w:val="false"/>
-                <w:smallCaps w:val="false"/>
-                <w:strike w:val="false"/>
-                <w:dstrike w:val="false"/>
-                <w:color w:val="000000"/>
-                <w:position w:val="0"/>
-                <w:sz w:val="24"/>
+                <w:caps w:val="false"/>
+                <w:smallCaps w:val="false"/>
+                <w:strike w:val="false"/>
+                <w:dstrike w:val="false"/>
+                <w:color w:val="000000"/>
+                <w:position w:val="0"/>
                 <w:sz w:val="24"/>
                 <w:szCs w:val="24"/>
                 <w:u w:val="none"/>
@@ -3482,7 +3441,6 @@
                 <w:dstrike w:val="false"/>
                 <w:color w:val="000000"/>
                 <w:position w:val="0"/>
-                <w:sz w:val="24"/>
                 <w:sz w:val="24"/>
                 <w:szCs w:val="24"/>
                 <w:u w:val="none"/>
@@ -3519,7 +3477,6 @@
                 <w:dstrike w:val="false"/>
                 <w:color w:val="000000"/>
                 <w:position w:val="0"/>
-                <w:sz w:val="24"/>
                 <w:sz w:val="24"/>
                 <w:szCs w:val="24"/>
                 <w:u w:val="none"/>
@@ -3537,7 +3494,7 @@
         </w:trPr>
         <w:tc>
           <w:tcPr>
-            <w:tcW w:w="1284" w:type="dxa"/>
+            <w:tcW w:w="1905" w:type="dxa"/>
             <w:tcBorders>
               <w:top w:val="single" w:sz="4" w:space="0" w:color="000000"/>
               <w:left w:val="single" w:sz="4" w:space="0" w:color="000000"/>
@@ -3572,7 +3529,7 @@
         </w:tc>
         <w:tc>
           <w:tcPr>
-            <w:tcW w:w="3329" w:type="dxa"/>
+            <w:tcW w:w="2708" w:type="dxa"/>
             <w:tcBorders>
               <w:top w:val="single" w:sz="4" w:space="0" w:color="000000"/>
               <w:left w:val="single" w:sz="4" w:space="0" w:color="000000"/>
@@ -3594,14 +3551,12 @@
                 <w:rFonts w:ascii="Arial" w:hAnsi="Arial" w:eastAsia="Times New Roman" w:cs="Times New Roman"/>
                 <w:b w:val="false"/>
                 <w:i w:val="false"/>
-                <w:i w:val="false"/>
-                <w:caps w:val="false"/>
-                <w:smallCaps w:val="false"/>
-                <w:strike w:val="false"/>
-                <w:dstrike w:val="false"/>
-                <w:color w:val="000000"/>
-                <w:position w:val="0"/>
-                <w:sz w:val="24"/>
+                <w:caps w:val="false"/>
+                <w:smallCaps w:val="false"/>
+                <w:strike w:val="false"/>
+                <w:dstrike w:val="false"/>
+                <w:color w:val="000000"/>
+                <w:position w:val="0"/>
                 <w:sz w:val="24"/>
                 <w:szCs w:val="24"/>
                 <w:u w:val="none"/>
@@ -3620,7 +3575,6 @@
                 <w:dstrike w:val="false"/>
                 <w:color w:val="000000"/>
                 <w:position w:val="0"/>
-                <w:sz w:val="24"/>
                 <w:sz w:val="24"/>
                 <w:szCs w:val="24"/>
                 <w:u w:val="none"/>
@@ -3771,7 +3725,6 @@
                 <w:dstrike w:val="false"/>
                 <w:color w:val="000000"/>
                 <w:position w:val="0"/>
-                <w:sz w:val="24"/>
                 <w:sz w:val="24"/>
                 <w:szCs w:val="24"/>
                 <w:u w:val="none"/>
@@ -3810,7 +3763,6 @@
                 <w:color w:val="000000"/>
                 <w:position w:val="0"/>
                 <w:sz w:val="24"/>
-                <w:sz w:val="24"/>
                 <w:szCs w:val="24"/>
                 <w:u w:val="none"/>
                 <w:shd w:fill="auto" w:val="clear"/>
@@ -3859,7 +3811,6 @@
                 <w:color w:val="000000"/>
                 <w:position w:val="0"/>
                 <w:sz w:val="24"/>
-                <w:sz w:val="24"/>
                 <w:szCs w:val="24"/>
                 <w:u w:val="none"/>
                 <w:shd w:fill="auto" w:val="clear"/>
@@ -3897,7 +3848,6 @@
                 <w:color w:val="000000"/>
                 <w:position w:val="0"/>
                 <w:sz w:val="24"/>
-                <w:sz w:val="24"/>
                 <w:szCs w:val="24"/>
                 <w:u w:val="none"/>
                 <w:shd w:fill="auto" w:val="clear"/>
@@ -3909,7 +3859,7 @@
         </w:tc>
         <w:tc>
           <w:tcPr>
-            <w:tcW w:w="2651" w:type="dxa"/>
+            <w:tcW w:w="2652" w:type="dxa"/>
             <w:tcBorders>
               <w:top w:val="single" w:sz="4" w:space="0" w:color="000000"/>
               <w:left w:val="single" w:sz="4" w:space="0" w:color="000000"/>
@@ -3946,7 +3896,6 @@
                 <w:color w:val="000000"/>
                 <w:position w:val="0"/>
                 <w:sz w:val="24"/>
-                <w:sz w:val="24"/>
                 <w:szCs w:val="24"/>
                 <w:u w:val="none"/>
                 <w:shd w:fill="auto" w:val="clear"/>
@@ -3983,7 +3932,6 @@
                 <w:dstrike w:val="false"/>
                 <w:color w:val="000000"/>
                 <w:position w:val="0"/>
-                <w:sz w:val="24"/>
                 <w:sz w:val="24"/>
                 <w:szCs w:val="24"/>
                 <w:u w:val="none"/>
@@ -4001,7 +3949,7 @@
         </w:trPr>
         <w:tc>
           <w:tcPr>
-            <w:tcW w:w="1284" w:type="dxa"/>
+            <w:tcW w:w="1905" w:type="dxa"/>
             <w:tcBorders>
               <w:top w:val="single" w:sz="4" w:space="0" w:color="000000"/>
               <w:left w:val="single" w:sz="4" w:space="0" w:color="000000"/>
@@ -4030,37 +3978,25 @@
                 <w:sz w:val="24"/>
                 <w:szCs w:val="24"/>
               </w:rPr>
-              <w:t>14H30 ÀS</w:t>
-            </w:r>
-          </w:p>
-          <w:p>
-            <w:pPr>
-              <w:pStyle w:val="normal1"/>
-              <w:spacing w:lineRule="auto" w:line="211"/>
-              <w:ind w:hanging="0" w:left="169" w:right="168"/>
-              <w:jc w:val="center"/>
-              <w:rPr>
-                <w:rFonts w:ascii="Arial" w:hAnsi="Arial"/>
-                <w:color w:val="000000"/>
-                <w:sz w:val="24"/>
-                <w:szCs w:val="24"/>
-              </w:rPr>
-            </w:pPr>
-            <w:r>
-              <w:rPr>
-                <w:rFonts w:ascii="Arial" w:hAnsi="Arial"/>
-                <w:b/>
-                <w:color w:val="000000"/>
-                <w:sz w:val="24"/>
-                <w:szCs w:val="24"/>
-              </w:rPr>
-              <w:t>15H00</w:t>
-            </w:r>
-          </w:p>
-        </w:tc>
-        <w:tc>
-          <w:tcPr>
-            <w:tcW w:w="3329" w:type="dxa"/>
+              <w:t>14H</w:t>
+            </w:r>
+            <w:r>
+              <w:rPr>
+                <w:rFonts w:ascii="Arial" w:hAnsi="Arial"/>
+                <w:b/>
+                <w:color w:val="000000"/>
+                <w:sz w:val="24"/>
+                <w:szCs w:val="24"/>
+              </w:rPr>
+              <w:t xml:space="preserve"> ~ 17H</w:t>
+              <w:br/>
+              <w:t>Com intervalo de 30 ~ 45 min em cada atividade</w:t>
+            </w:r>
+          </w:p>
+        </w:tc>
+        <w:tc>
+          <w:tcPr>
+            <w:tcW w:w="2708" w:type="dxa"/>
             <w:tcBorders>
               <w:top w:val="single" w:sz="4" w:space="0" w:color="000000"/>
               <w:left w:val="single" w:sz="4" w:space="0" w:color="000000"/>
@@ -4321,14 +4257,12 @@
                 <w:rFonts w:ascii="Arial" w:hAnsi="Arial" w:eastAsia="Times New Roman" w:cs="Times New Roman"/>
                 <w:b w:val="false"/>
                 <w:i w:val="false"/>
-                <w:i w:val="false"/>
-                <w:caps w:val="false"/>
-                <w:smallCaps w:val="false"/>
-                <w:strike w:val="false"/>
-                <w:dstrike w:val="false"/>
-                <w:color w:val="000000"/>
-                <w:position w:val="0"/>
-                <w:sz w:val="24"/>
+                <w:caps w:val="false"/>
+                <w:smallCaps w:val="false"/>
+                <w:strike w:val="false"/>
+                <w:dstrike w:val="false"/>
+                <w:color w:val="000000"/>
+                <w:position w:val="0"/>
                 <w:sz w:val="24"/>
                 <w:szCs w:val="24"/>
                 <w:u w:val="none"/>
@@ -4347,7 +4281,6 @@
                 <w:dstrike w:val="false"/>
                 <w:color w:val="000000"/>
                 <w:position w:val="0"/>
-                <w:sz w:val="24"/>
                 <w:sz w:val="24"/>
                 <w:szCs w:val="24"/>
                 <w:u w:val="none"/>
@@ -4448,7 +4381,7 @@
         </w:tc>
         <w:tc>
           <w:tcPr>
-            <w:tcW w:w="2651" w:type="dxa"/>
+            <w:tcW w:w="2652" w:type="dxa"/>
             <w:tcBorders>
               <w:top w:val="single" w:sz="4" w:space="0" w:color="000000"/>
               <w:left w:val="single" w:sz="4" w:space="0" w:color="000000"/>
@@ -4566,9 +4499,9 @@
     <w:tbl>
       <w:tblPr>
         <w:tblStyle w:val="Table3"/>
-        <w:tblW w:w="15549" w:type="dxa"/>
+        <w:tblW w:w="15426" w:type="dxa"/>
         <w:jc w:val="left"/>
-        <w:tblInd w:w="110" w:type="dxa"/>
+        <w:tblInd w:w="233" w:type="dxa"/>
         <w:tblLayout w:type="fixed"/>
         <w:tblCellMar>
           <w:top w:w="0" w:type="dxa"/>
@@ -4579,12 +4512,12 @@
         <w:tblLook w:val="0000"/>
       </w:tblPr>
       <w:tblGrid>
-        <w:gridCol w:w="1284"/>
-        <w:gridCol w:w="3329"/>
-        <w:gridCol w:w="2881"/>
-        <w:gridCol w:w="2615"/>
-        <w:gridCol w:w="2788"/>
-        <w:gridCol w:w="2651"/>
+        <w:gridCol w:w="2055"/>
+        <w:gridCol w:w="2445"/>
+        <w:gridCol w:w="2880"/>
+        <w:gridCol w:w="2610"/>
+        <w:gridCol w:w="2790"/>
+        <w:gridCol w:w="2646"/>
       </w:tblGrid>
       <w:tr>
         <w:trPr>
@@ -4592,7 +4525,7 @@
         </w:trPr>
         <w:tc>
           <w:tcPr>
-            <w:tcW w:w="1284" w:type="dxa"/>
+            <w:tcW w:w="2055" w:type="dxa"/>
             <w:tcBorders>
               <w:left w:val="single" w:sz="4" w:space="0" w:color="000000"/>
               <w:bottom w:val="single" w:sz="4" w:space="0" w:color="000000"/>
@@ -4620,37 +4553,23 @@
                 <w:sz w:val="24"/>
                 <w:szCs w:val="24"/>
               </w:rPr>
-              <w:t>15H30 ÀS</w:t>
-            </w:r>
-          </w:p>
-          <w:p>
-            <w:pPr>
-              <w:pStyle w:val="normal1"/>
-              <w:spacing w:lineRule="auto" w:line="211"/>
-              <w:ind w:hanging="0" w:left="169" w:right="168"/>
-              <w:jc w:val="center"/>
-              <w:rPr>
-                <w:rFonts w:ascii="Arial" w:hAnsi="Arial"/>
-                <w:color w:val="000000"/>
-                <w:sz w:val="24"/>
-                <w:szCs w:val="24"/>
-              </w:rPr>
-            </w:pPr>
-            <w:r>
-              <w:rPr>
-                <w:rFonts w:ascii="Arial" w:hAnsi="Arial"/>
-                <w:b/>
-                <w:color w:val="000000"/>
-                <w:sz w:val="24"/>
-                <w:szCs w:val="24"/>
-              </w:rPr>
-              <w:t>15H50</w:t>
-            </w:r>
-          </w:p>
-        </w:tc>
-        <w:tc>
-          <w:tcPr>
-            <w:tcW w:w="3329" w:type="dxa"/>
+              <w:t>1</w:t>
+            </w:r>
+            <w:r>
+              <w:rPr>
+                <w:rFonts w:ascii="Arial" w:hAnsi="Arial"/>
+                <w:b/>
+                <w:color w:val="000000"/>
+                <w:sz w:val="24"/>
+                <w:szCs w:val="24"/>
+              </w:rPr>
+              <w:t>6:45 ~ 17H</w:t>
+            </w:r>
+          </w:p>
+        </w:tc>
+        <w:tc>
+          <w:tcPr>
+            <w:tcW w:w="2445" w:type="dxa"/>
             <w:tcBorders>
               <w:left w:val="single" w:sz="4" w:space="0" w:color="000000"/>
               <w:bottom w:val="single" w:sz="4" w:space="0" w:color="000000"/>
@@ -4686,7 +4605,6 @@
                 <w:color w:val="000000"/>
                 <w:position w:val="0"/>
                 <w:sz w:val="24"/>
-                <w:sz w:val="24"/>
                 <w:szCs w:val="24"/>
                 <w:u w:val="none"/>
                 <w:shd w:fill="auto" w:val="clear"/>
@@ -4716,7 +4634,6 @@
                 <w:color w:val="000000"/>
                 <w:position w:val="0"/>
                 <w:sz w:val="24"/>
-                <w:sz w:val="24"/>
                 <w:szCs w:val="24"/>
                 <w:u w:val="none"/>
                 <w:shd w:fill="auto" w:val="clear"/>
@@ -4728,7 +4645,7 @@
         </w:tc>
         <w:tc>
           <w:tcPr>
-            <w:tcW w:w="2881" w:type="dxa"/>
+            <w:tcW w:w="2880" w:type="dxa"/>
             <w:tcBorders>
               <w:left w:val="single" w:sz="4" w:space="0" w:color="000000"/>
               <w:bottom w:val="single" w:sz="4" w:space="0" w:color="000000"/>
@@ -4762,7 +4679,7 @@
         </w:tc>
         <w:tc>
           <w:tcPr>
-            <w:tcW w:w="2615" w:type="dxa"/>
+            <w:tcW w:w="2610" w:type="dxa"/>
             <w:tcBorders>
               <w:left w:val="single" w:sz="4" w:space="0" w:color="000000"/>
               <w:bottom w:val="single" w:sz="4" w:space="0" w:color="000000"/>
@@ -4796,7 +4713,7 @@
         </w:tc>
         <w:tc>
           <w:tcPr>
-            <w:tcW w:w="2788" w:type="dxa"/>
+            <w:tcW w:w="2790" w:type="dxa"/>
             <w:tcBorders>
               <w:left w:val="single" w:sz="4" w:space="0" w:color="000000"/>
               <w:bottom w:val="single" w:sz="4" w:space="0" w:color="000000"/>
@@ -4830,7 +4747,7 @@
         </w:tc>
         <w:tc>
           <w:tcPr>
-            <w:tcW w:w="2651" w:type="dxa"/>
+            <w:tcW w:w="2646" w:type="dxa"/>
             <w:tcBorders>
               <w:left w:val="single" w:sz="4" w:space="0" w:color="000000"/>
               <w:bottom w:val="single" w:sz="4" w:space="0" w:color="000000"/>
@@ -4869,7 +4786,7 @@
         </w:trPr>
         <w:tc>
           <w:tcPr>
-            <w:tcW w:w="1284" w:type="dxa"/>
+            <w:tcW w:w="2055" w:type="dxa"/>
             <w:tcBorders>
               <w:top w:val="single" w:sz="4" w:space="0" w:color="000000"/>
               <w:left w:val="single" w:sz="4" w:space="0" w:color="000000"/>
@@ -4898,37 +4815,13 @@
                 <w:sz w:val="24"/>
                 <w:szCs w:val="24"/>
               </w:rPr>
-              <w:t>16H40 ÀS</w:t>
-            </w:r>
-          </w:p>
-          <w:p>
-            <w:pPr>
-              <w:pStyle w:val="normal1"/>
-              <w:spacing w:lineRule="auto" w:line="211"/>
-              <w:ind w:hanging="0" w:left="169" w:right="168"/>
-              <w:jc w:val="center"/>
-              <w:rPr>
-                <w:rFonts w:ascii="Arial" w:hAnsi="Arial"/>
-                <w:color w:val="000000"/>
-                <w:sz w:val="24"/>
-                <w:szCs w:val="24"/>
-              </w:rPr>
-            </w:pPr>
-            <w:r>
-              <w:rPr>
-                <w:rFonts w:ascii="Arial" w:hAnsi="Arial"/>
-                <w:b/>
-                <w:color w:val="000000"/>
-                <w:sz w:val="24"/>
-                <w:szCs w:val="24"/>
-              </w:rPr>
-              <w:t>17H20</w:t>
-            </w:r>
-          </w:p>
-        </w:tc>
-        <w:tc>
-          <w:tcPr>
-            <w:tcW w:w="3329" w:type="dxa"/>
+              <w:t>Horarios citados ao lado</w:t>
+            </w:r>
+          </w:p>
+        </w:tc>
+        <w:tc>
+          <w:tcPr>
+            <w:tcW w:w="2445" w:type="dxa"/>
             <w:tcBorders>
               <w:top w:val="single" w:sz="4" w:space="0" w:color="000000"/>
               <w:left w:val="single" w:sz="4" w:space="0" w:color="000000"/>
@@ -4995,7 +4888,7 @@
         </w:tc>
         <w:tc>
           <w:tcPr>
-            <w:tcW w:w="2881" w:type="dxa"/>
+            <w:tcW w:w="2880" w:type="dxa"/>
             <w:tcBorders>
               <w:top w:val="single" w:sz="4" w:space="0" w:color="000000"/>
               <w:left w:val="single" w:sz="4" w:space="0" w:color="000000"/>
@@ -5042,13 +4935,23 @@
                 <w:sz w:val="24"/>
                 <w:szCs w:val="24"/>
               </w:rPr>
-              <w:t>Parque</w:t>
-            </w:r>
-          </w:p>
-        </w:tc>
-        <w:tc>
-          <w:tcPr>
-            <w:tcW w:w="2615" w:type="dxa"/>
+              <w:t xml:space="preserve">Parque </w:t>
+            </w:r>
+            <w:r>
+              <w:rPr>
+                <w:rFonts w:eastAsia="Arial" w:cs="Arial" w:ascii="Arial" w:hAnsi="Arial"/>
+                <w:b/>
+                <w:color w:val="000000"/>
+                <w:sz w:val="24"/>
+                <w:szCs w:val="24"/>
+              </w:rPr>
+              <w:t>(14:30)</w:t>
+            </w:r>
+          </w:p>
+        </w:tc>
+        <w:tc>
+          <w:tcPr>
+            <w:tcW w:w="2610" w:type="dxa"/>
             <w:tcBorders>
               <w:top w:val="single" w:sz="4" w:space="0" w:color="000000"/>
               <w:left w:val="single" w:sz="4" w:space="0" w:color="000000"/>
@@ -5074,7 +4977,17 @@
                 <w:sz w:val="24"/>
                 <w:szCs w:val="24"/>
               </w:rPr>
-              <w:t>Quadra</w:t>
+              <w:t xml:space="preserve">Quadra </w:t>
+            </w:r>
+            <w:r>
+              <w:rPr>
+                <w:rFonts w:eastAsia="Arial" w:cs="Arial" w:ascii="Arial" w:hAnsi="Arial"/>
+                <w:b/>
+                <w:color w:val="000000"/>
+                <w:sz w:val="24"/>
+                <w:szCs w:val="24"/>
+              </w:rPr>
+              <w:t>(Horario a definir)</w:t>
             </w:r>
           </w:p>
           <w:p>
@@ -5122,7 +5035,7 @@
         </w:tc>
         <w:tc>
           <w:tcPr>
-            <w:tcW w:w="2788" w:type="dxa"/>
+            <w:tcW w:w="2790" w:type="dxa"/>
             <w:tcBorders>
               <w:top w:val="single" w:sz="4" w:space="0" w:color="000000"/>
               <w:left w:val="single" w:sz="4" w:space="0" w:color="000000"/>
@@ -5148,7 +5061,17 @@
                 <w:sz w:val="24"/>
                 <w:szCs w:val="24"/>
               </w:rPr>
-              <w:t>Solário</w:t>
+              <w:t xml:space="preserve">Solário </w:t>
+            </w:r>
+            <w:r>
+              <w:rPr>
+                <w:rFonts w:eastAsia="Arial" w:cs="Arial" w:ascii="Arial" w:hAnsi="Arial"/>
+                <w:b/>
+                <w:color w:val="000000"/>
+                <w:sz w:val="24"/>
+                <w:szCs w:val="24"/>
+              </w:rPr>
+              <w:t>(14:30)</w:t>
             </w:r>
           </w:p>
           <w:p>
@@ -5196,7 +5119,7 @@
         </w:tc>
         <w:tc>
           <w:tcPr>
-            <w:tcW w:w="2651" w:type="dxa"/>
+            <w:tcW w:w="2646" w:type="dxa"/>
             <w:tcBorders>
               <w:top w:val="single" w:sz="4" w:space="0" w:color="000000"/>
               <w:left w:val="single" w:sz="4" w:space="0" w:color="000000"/>
@@ -5243,7 +5166,17 @@
                 <w:sz w:val="24"/>
                 <w:szCs w:val="24"/>
               </w:rPr>
-              <w:t>Parque</w:t>
+              <w:t xml:space="preserve">Parque </w:t>
+            </w:r>
+            <w:r>
+              <w:rPr>
+                <w:rFonts w:eastAsia="Arial" w:cs="Arial" w:ascii="Arial" w:hAnsi="Arial"/>
+                <w:b/>
+                <w:color w:val="000000"/>
+                <w:sz w:val="24"/>
+                <w:szCs w:val="24"/>
+              </w:rPr>
+              <w:t>(14:30)</w:t>
             </w:r>
           </w:p>
         </w:tc>
@@ -5254,7 +5187,7 @@
         </w:trPr>
         <w:tc>
           <w:tcPr>
-            <w:tcW w:w="1284" w:type="dxa"/>
+            <w:tcW w:w="2055" w:type="dxa"/>
             <w:tcBorders>
               <w:top w:val="single" w:sz="4" w:space="0" w:color="000000"/>
               <w:left w:val="single" w:sz="4" w:space="0" w:color="000000"/>
@@ -5283,37 +5216,13 @@
                 <w:sz w:val="24"/>
                 <w:szCs w:val="24"/>
               </w:rPr>
-              <w:t>17H20 ÀS</w:t>
-            </w:r>
-          </w:p>
-          <w:p>
-            <w:pPr>
-              <w:pStyle w:val="normal1"/>
-              <w:spacing w:lineRule="auto" w:line="211"/>
-              <w:ind w:hanging="0" w:left="169" w:right="168"/>
-              <w:jc w:val="center"/>
-              <w:rPr>
-                <w:rFonts w:ascii="Arial" w:hAnsi="Arial"/>
-                <w:color w:val="000000"/>
-                <w:sz w:val="24"/>
-                <w:szCs w:val="24"/>
-              </w:rPr>
-            </w:pPr>
-            <w:r>
-              <w:rPr>
-                <w:rFonts w:ascii="Arial" w:hAnsi="Arial"/>
-                <w:b/>
-                <w:color w:val="000000"/>
-                <w:sz w:val="24"/>
-                <w:szCs w:val="24"/>
-              </w:rPr>
-              <w:t>17H45</w:t>
-            </w:r>
-          </w:p>
-        </w:tc>
-        <w:tc>
-          <w:tcPr>
-            <w:tcW w:w="3329" w:type="dxa"/>
+              <w:t>17:30 ~ 17:40</w:t>
+            </w:r>
+          </w:p>
+        </w:tc>
+        <w:tc>
+          <w:tcPr>
+            <w:tcW w:w="2445" w:type="dxa"/>
             <w:tcBorders>
               <w:top w:val="single" w:sz="4" w:space="0" w:color="000000"/>
               <w:left w:val="single" w:sz="4" w:space="0" w:color="000000"/>
@@ -5380,7 +5289,7 @@
         </w:tc>
         <w:tc>
           <w:tcPr>
-            <w:tcW w:w="2881" w:type="dxa"/>
+            <w:tcW w:w="2880" w:type="dxa"/>
             <w:tcBorders>
               <w:top w:val="single" w:sz="4" w:space="0" w:color="000000"/>
               <w:left w:val="single" w:sz="4" w:space="0" w:color="000000"/>
@@ -5412,7 +5321,7 @@
         </w:tc>
         <w:tc>
           <w:tcPr>
-            <w:tcW w:w="2615" w:type="dxa"/>
+            <w:tcW w:w="2610" w:type="dxa"/>
             <w:tcBorders>
               <w:top w:val="single" w:sz="4" w:space="0" w:color="000000"/>
               <w:left w:val="single" w:sz="4" w:space="0" w:color="000000"/>
@@ -5444,7 +5353,7 @@
         </w:tc>
         <w:tc>
           <w:tcPr>
-            <w:tcW w:w="2788" w:type="dxa"/>
+            <w:tcW w:w="2790" w:type="dxa"/>
             <w:tcBorders>
               <w:top w:val="single" w:sz="4" w:space="0" w:color="000000"/>
               <w:left w:val="single" w:sz="4" w:space="0" w:color="000000"/>
@@ -5478,7 +5387,7 @@
         </w:tc>
         <w:tc>
           <w:tcPr>
-            <w:tcW w:w="2651" w:type="dxa"/>
+            <w:tcW w:w="2646" w:type="dxa"/>
             <w:tcBorders>
               <w:top w:val="single" w:sz="4" w:space="0" w:color="000000"/>
               <w:left w:val="single" w:sz="4" w:space="0" w:color="000000"/>
@@ -5507,6 +5416,253 @@
               <w:t>Organização da sala</w:t>
               <w:br/>
               <w:t>roda de musica</w:t>
+            </w:r>
+          </w:p>
+        </w:tc>
+      </w:tr>
+      <w:tr>
+        <w:trPr>
+          <w:trHeight w:val="3226" w:hRule="atLeast"/>
+        </w:trPr>
+        <w:tc>
+          <w:tcPr>
+            <w:tcW w:w="2055" w:type="dxa"/>
+            <w:tcBorders>
+              <w:left w:val="single" w:sz="4" w:space="0" w:color="000000"/>
+              <w:bottom w:val="single" w:sz="4" w:space="0" w:color="000000"/>
+              <w:right w:val="single" w:sz="4" w:space="0" w:color="000000"/>
+            </w:tcBorders>
+          </w:tcPr>
+          <w:p>
+            <w:pPr>
+              <w:pStyle w:val="normal1"/>
+              <w:spacing w:lineRule="auto" w:line="209"/>
+              <w:ind w:hanging="0" w:left="172" w:right="168"/>
+              <w:jc w:val="center"/>
+              <w:rPr>
+                <w:rFonts w:ascii="Arial" w:hAnsi="Arial"/>
+                <w:b/>
+                <w:bCs/>
+                <w:color w:val="000000"/>
+                <w:sz w:val="24"/>
+                <w:szCs w:val="24"/>
+              </w:rPr>
+            </w:pPr>
+            <w:r>
+              <w:rPr>
+                <w:rFonts w:ascii="Arial" w:hAnsi="Arial"/>
+                <w:b/>
+                <w:bCs/>
+                <w:color w:val="000000"/>
+                <w:sz w:val="24"/>
+                <w:szCs w:val="24"/>
+              </w:rPr>
+              <w:t>17:45H</w:t>
+            </w:r>
+          </w:p>
+        </w:tc>
+        <w:tc>
+          <w:tcPr>
+            <w:tcW w:w="2445" w:type="dxa"/>
+            <w:tcBorders>
+              <w:left w:val="single" w:sz="4" w:space="0" w:color="000000"/>
+              <w:bottom w:val="single" w:sz="4" w:space="0" w:color="000000"/>
+              <w:right w:val="single" w:sz="4" w:space="0" w:color="000000"/>
+            </w:tcBorders>
+          </w:tcPr>
+          <w:p>
+            <w:pPr>
+              <w:pStyle w:val="normal1"/>
+              <w:keepNext w:val="false"/>
+              <w:keepLines w:val="false"/>
+              <w:widowControl w:val="false"/>
+              <w:shd w:val="clear" w:fill="auto"/>
+              <w:spacing w:lineRule="auto" w:line="240" w:before="0" w:after="0"/>
+              <w:ind w:hanging="0" w:left="0" w:right="0"/>
+              <w:jc w:val="left"/>
+              <w:rPr>
+                <w:rFonts w:ascii="Arial" w:hAnsi="Arial"/>
+                <w:b/>
+                <w:bCs/>
+                <w:color w:val="000000"/>
+                <w:sz w:val="24"/>
+                <w:szCs w:val="24"/>
+              </w:rPr>
+            </w:pPr>
+            <w:r>
+              <w:rPr>
+                <w:rFonts w:ascii="Arial" w:hAnsi="Arial"/>
+                <w:b/>
+                <w:bCs/>
+                <w:color w:val="000000"/>
+                <w:sz w:val="24"/>
+                <w:szCs w:val="24"/>
+              </w:rPr>
+              <w:t>SAIDA</w:t>
+            </w:r>
+          </w:p>
+        </w:tc>
+        <w:tc>
+          <w:tcPr>
+            <w:tcW w:w="2880" w:type="dxa"/>
+            <w:tcBorders>
+              <w:left w:val="single" w:sz="4" w:space="0" w:color="000000"/>
+              <w:bottom w:val="single" w:sz="4" w:space="0" w:color="000000"/>
+              <w:right w:val="single" w:sz="4" w:space="0" w:color="000000"/>
+            </w:tcBorders>
+          </w:tcPr>
+          <w:p>
+            <w:pPr>
+              <w:pStyle w:val="normal1"/>
+              <w:keepNext w:val="false"/>
+              <w:keepLines w:val="false"/>
+              <w:widowControl w:val="false"/>
+              <w:shd w:val="clear" w:fill="auto"/>
+              <w:spacing w:lineRule="auto" w:line="240" w:before="0" w:after="0"/>
+              <w:ind w:hanging="0" w:left="0" w:right="0"/>
+              <w:jc w:val="left"/>
+              <w:rPr>
+                <w:rFonts w:ascii="Arial" w:hAnsi="Arial"/>
+                <w:b/>
+                <w:bCs/>
+                <w:color w:val="000000"/>
+                <w:sz w:val="24"/>
+                <w:szCs w:val="24"/>
+              </w:rPr>
+            </w:pPr>
+            <w:r>
+              <w:rPr>
+                <w:rFonts w:ascii="Arial" w:hAnsi="Arial"/>
+                <w:b/>
+                <w:bCs/>
+                <w:color w:val="000000"/>
+                <w:sz w:val="24"/>
+                <w:szCs w:val="24"/>
+              </w:rPr>
+              <w:t>SAIDA</w:t>
+            </w:r>
+          </w:p>
+        </w:tc>
+        <w:tc>
+          <w:tcPr>
+            <w:tcW w:w="2610" w:type="dxa"/>
+            <w:tcBorders>
+              <w:left w:val="single" w:sz="4" w:space="0" w:color="000000"/>
+              <w:bottom w:val="single" w:sz="4" w:space="0" w:color="000000"/>
+              <w:right w:val="single" w:sz="4" w:space="0" w:color="000000"/>
+            </w:tcBorders>
+          </w:tcPr>
+          <w:p>
+            <w:pPr>
+              <w:pStyle w:val="normal1"/>
+              <w:keepNext w:val="false"/>
+              <w:keepLines w:val="false"/>
+              <w:widowControl w:val="false"/>
+              <w:shd w:val="clear" w:fill="auto"/>
+              <w:spacing w:lineRule="auto" w:line="240" w:before="0" w:after="0"/>
+              <w:ind w:hanging="0" w:left="0" w:right="0"/>
+              <w:jc w:val="left"/>
+              <w:rPr>
+                <w:rFonts w:ascii="Arial" w:hAnsi="Arial"/>
+                <w:b/>
+                <w:bCs/>
+                <w:color w:val="000000"/>
+                <w:sz w:val="24"/>
+                <w:szCs w:val="24"/>
+              </w:rPr>
+            </w:pPr>
+            <w:r>
+              <w:rPr>
+                <w:rFonts w:ascii="Arial" w:hAnsi="Arial"/>
+                <w:b/>
+                <w:bCs/>
+                <w:color w:val="000000"/>
+                <w:sz w:val="24"/>
+                <w:szCs w:val="24"/>
+              </w:rPr>
+              <w:t>SAIDA</w:t>
+            </w:r>
+          </w:p>
+        </w:tc>
+        <w:tc>
+          <w:tcPr>
+            <w:tcW w:w="2790" w:type="dxa"/>
+            <w:tcBorders>
+              <w:left w:val="single" w:sz="4" w:space="0" w:color="000000"/>
+              <w:bottom w:val="single" w:sz="4" w:space="0" w:color="000000"/>
+              <w:right w:val="single" w:sz="4" w:space="0" w:color="000000"/>
+            </w:tcBorders>
+          </w:tcPr>
+          <w:p>
+            <w:pPr>
+              <w:pStyle w:val="normal1"/>
+              <w:keepNext w:val="false"/>
+              <w:keepLines w:val="false"/>
+              <w:widowControl w:val="false"/>
+              <w:shd w:val="clear" w:fill="auto"/>
+              <w:spacing w:lineRule="auto" w:line="240" w:before="0" w:after="0"/>
+              <w:ind w:hanging="0" w:left="0" w:right="0"/>
+              <w:jc w:val="left"/>
+              <w:rPr>
+                <w:rFonts w:ascii="Arial" w:hAnsi="Arial"/>
+                <w:b/>
+                <w:bCs/>
+                <w:color w:val="000000"/>
+                <w:sz w:val="24"/>
+                <w:szCs w:val="24"/>
+              </w:rPr>
+            </w:pPr>
+            <w:r>
+              <w:rPr>
+                <w:rFonts w:ascii="Arial" w:hAnsi="Arial"/>
+                <w:b/>
+                <w:bCs/>
+                <w:color w:val="000000"/>
+                <w:sz w:val="24"/>
+                <w:szCs w:val="24"/>
+              </w:rPr>
+              <w:t>SAIDA</w:t>
+            </w:r>
+          </w:p>
+        </w:tc>
+        <w:tc>
+          <w:tcPr>
+            <w:tcW w:w="2646" w:type="dxa"/>
+            <w:tcBorders>
+              <w:left w:val="single" w:sz="4" w:space="0" w:color="000000"/>
+              <w:bottom w:val="single" w:sz="4" w:space="0" w:color="000000"/>
+              <w:right w:val="single" w:sz="4" w:space="0" w:color="000000"/>
+            </w:tcBorders>
+          </w:tcPr>
+          <w:p>
+            <w:pPr>
+              <w:pStyle w:val="normal1"/>
+              <w:keepNext w:val="false"/>
+              <w:keepLines w:val="false"/>
+              <w:widowControl w:val="false"/>
+              <w:shd w:val="clear" w:fill="auto"/>
+              <w:spacing w:lineRule="auto" w:line="240" w:before="0" w:after="0"/>
+              <w:ind w:hanging="0" w:left="0" w:right="0"/>
+              <w:jc w:val="left"/>
+              <w:rPr>
+                <w:rFonts w:ascii="Arial" w:hAnsi="Arial"/>
+                <w:b/>
+                <w:bCs/>
+                <w:color w:val="000000"/>
+                <w:sz w:val="24"/>
+                <w:szCs w:val="24"/>
+              </w:rPr>
+            </w:pPr>
+            <w:r>
+              <w:rPr>
+                <w:rFonts w:ascii="Arial" w:hAnsi="Arial"/>
+                <w:b/>
+                <w:bCs/>
+                <w:color w:val="000000"/>
+                <w:sz w:val="24"/>
+                <w:szCs w:val="24"/>
+              </w:rPr>
+              <w:t>SAIDA</w:t>
             </w:r>
           </w:p>
         </w:tc>
@@ -5517,7 +5673,7 @@
         </w:trPr>
         <w:tc>
           <w:tcPr>
-            <w:tcW w:w="1284" w:type="dxa"/>
+            <w:tcW w:w="2055" w:type="dxa"/>
             <w:tcBorders>
               <w:top w:val="single" w:sz="4" w:space="0" w:color="000000"/>
               <w:left w:val="single" w:sz="4" w:space="0" w:color="000000"/>
@@ -5539,14 +5695,12 @@
                 <w:rFonts w:ascii="Arial" w:hAnsi="Arial" w:eastAsia="Times New Roman" w:cs="Times New Roman"/>
                 <w:b w:val="false"/>
                 <w:i w:val="false"/>
-                <w:i w:val="false"/>
-                <w:caps w:val="false"/>
-                <w:smallCaps w:val="false"/>
-                <w:strike w:val="false"/>
-                <w:dstrike w:val="false"/>
-                <w:color w:val="000000"/>
-                <w:position w:val="0"/>
-                <w:sz w:val="24"/>
+                <w:caps w:val="false"/>
+                <w:smallCaps w:val="false"/>
+                <w:strike w:val="false"/>
+                <w:dstrike w:val="false"/>
+                <w:color w:val="000000"/>
+                <w:position w:val="0"/>
                 <w:sz w:val="24"/>
                 <w:szCs w:val="24"/>
                 <w:u w:val="none"/>
@@ -5566,18 +5720,17 @@
                 <w:color w:val="000000"/>
                 <w:position w:val="0"/>
                 <w:sz w:val="24"/>
-                <w:sz w:val="24"/>
-                <w:szCs w:val="24"/>
-                <w:u w:val="none"/>
-                <w:shd w:fill="auto" w:val="clear"/>
-                <w:vertAlign w:val="baseline"/>
-              </w:rPr>
-            </w:r>
-          </w:p>
-        </w:tc>
-        <w:tc>
-          <w:tcPr>
-            <w:tcW w:w="3329" w:type="dxa"/>
+                <w:szCs w:val="24"/>
+                <w:u w:val="none"/>
+                <w:shd w:fill="auto" w:val="clear"/>
+                <w:vertAlign w:val="baseline"/>
+              </w:rPr>
+            </w:r>
+          </w:p>
+        </w:tc>
+        <w:tc>
+          <w:tcPr>
+            <w:tcW w:w="2445" w:type="dxa"/>
             <w:tcBorders>
               <w:top w:val="single" w:sz="4" w:space="0" w:color="000000"/>
               <w:left w:val="single" w:sz="4" w:space="0" w:color="000000"/>
@@ -5620,7 +5773,7 @@
         </w:tc>
         <w:tc>
           <w:tcPr>
-            <w:tcW w:w="2881" w:type="dxa"/>
+            <w:tcW w:w="2880" w:type="dxa"/>
             <w:tcBorders>
               <w:top w:val="single" w:sz="4" w:space="0" w:color="000000"/>
               <w:left w:val="single" w:sz="4" w:space="0" w:color="000000"/>
@@ -5670,7 +5823,7 @@
         </w:tc>
         <w:tc>
           <w:tcPr>
-            <w:tcW w:w="2615" w:type="dxa"/>
+            <w:tcW w:w="2610" w:type="dxa"/>
             <w:tcBorders>
               <w:top w:val="single" w:sz="4" w:space="0" w:color="000000"/>
               <w:left w:val="single" w:sz="4" w:space="0" w:color="000000"/>
@@ -5692,14 +5845,12 @@
                 <w:rFonts w:ascii="Arial" w:hAnsi="Arial" w:eastAsia="Times New Roman" w:cs="Times New Roman"/>
                 <w:b w:val="false"/>
                 <w:i w:val="false"/>
-                <w:i w:val="false"/>
-                <w:caps w:val="false"/>
-                <w:smallCaps w:val="false"/>
-                <w:strike w:val="false"/>
-                <w:dstrike w:val="false"/>
-                <w:color w:val="000000"/>
-                <w:position w:val="0"/>
-                <w:sz w:val="24"/>
+                <w:caps w:val="false"/>
+                <w:smallCaps w:val="false"/>
+                <w:strike w:val="false"/>
+                <w:dstrike w:val="false"/>
+                <w:color w:val="000000"/>
+                <w:position w:val="0"/>
                 <w:sz w:val="24"/>
                 <w:szCs w:val="24"/>
                 <w:u w:val="none"/>
@@ -5718,7 +5869,6 @@
                 <w:dstrike w:val="false"/>
                 <w:color w:val="000000"/>
                 <w:position w:val="0"/>
-                <w:sz w:val="24"/>
                 <w:sz w:val="24"/>
                 <w:szCs w:val="24"/>
                 <w:u w:val="none"/>
@@ -5769,7 +5919,7 @@
         </w:tc>
         <w:tc>
           <w:tcPr>
-            <w:tcW w:w="2788" w:type="dxa"/>
+            <w:tcW w:w="2790" w:type="dxa"/>
             <w:tcBorders>
               <w:top w:val="single" w:sz="4" w:space="0" w:color="000000"/>
               <w:left w:val="single" w:sz="4" w:space="0" w:color="000000"/>
@@ -5791,14 +5941,12 @@
                 <w:rFonts w:ascii="Arial" w:hAnsi="Arial" w:eastAsia="Times New Roman" w:cs="Times New Roman"/>
                 <w:b w:val="false"/>
                 <w:i w:val="false"/>
-                <w:i w:val="false"/>
-                <w:caps w:val="false"/>
-                <w:smallCaps w:val="false"/>
-                <w:strike w:val="false"/>
-                <w:dstrike w:val="false"/>
-                <w:color w:val="000000"/>
-                <w:position w:val="0"/>
-                <w:sz w:val="24"/>
+                <w:caps w:val="false"/>
+                <w:smallCaps w:val="false"/>
+                <w:strike w:val="false"/>
+                <w:dstrike w:val="false"/>
+                <w:color w:val="000000"/>
+                <w:position w:val="0"/>
                 <w:sz w:val="24"/>
                 <w:szCs w:val="24"/>
                 <w:u w:val="none"/>
@@ -5817,7 +5965,6 @@
                 <w:dstrike w:val="false"/>
                 <w:color w:val="000000"/>
                 <w:position w:val="0"/>
-                <w:sz w:val="24"/>
                 <w:sz w:val="24"/>
                 <w:szCs w:val="24"/>
                 <w:u w:val="none"/>
@@ -5905,7 +6052,7 @@
         </w:tc>
         <w:tc>
           <w:tcPr>
-            <w:tcW w:w="2651" w:type="dxa"/>
+            <w:tcW w:w="2646" w:type="dxa"/>
             <w:tcBorders>
               <w:top w:val="single" w:sz="4" w:space="0" w:color="000000"/>
               <w:left w:val="single" w:sz="4" w:space="0" w:color="000000"/>
@@ -5927,14 +6074,12 @@
                 <w:rFonts w:ascii="Arial" w:hAnsi="Arial" w:eastAsia="Times New Roman" w:cs="Times New Roman"/>
                 <w:b w:val="false"/>
                 <w:i w:val="false"/>
-                <w:i w:val="false"/>
-                <w:caps w:val="false"/>
-                <w:smallCaps w:val="false"/>
-                <w:strike w:val="false"/>
-                <w:dstrike w:val="false"/>
-                <w:color w:val="000000"/>
-                <w:position w:val="0"/>
-                <w:sz w:val="24"/>
+                <w:caps w:val="false"/>
+                <w:smallCaps w:val="false"/>
+                <w:strike w:val="false"/>
+                <w:dstrike w:val="false"/>
+                <w:color w:val="000000"/>
+                <w:position w:val="0"/>
                 <w:sz w:val="24"/>
                 <w:szCs w:val="24"/>
                 <w:u w:val="none"/>
@@ -5953,7 +6098,6 @@
                 <w:dstrike w:val="false"/>
                 <w:color w:val="000000"/>
                 <w:position w:val="0"/>
-                <w:sz w:val="24"/>
                 <w:sz w:val="24"/>
                 <w:szCs w:val="24"/>
                 <w:u w:val="none"/>
@@ -6086,7 +6230,7 @@
         <w:gridCol w:w="2881"/>
         <w:gridCol w:w="2615"/>
         <w:gridCol w:w="2788"/>
-        <w:gridCol w:w="2651"/>
+        <w:gridCol w:w="2652"/>
       </w:tblGrid>
       <w:tr>
         <w:trPr>
@@ -6115,14 +6259,12 @@
                 <w:rFonts w:ascii="Arial" w:hAnsi="Arial" w:eastAsia="Times New Roman" w:cs="Times New Roman"/>
                 <w:b w:val="false"/>
                 <w:i w:val="false"/>
-                <w:i w:val="false"/>
-                <w:caps w:val="false"/>
-                <w:smallCaps w:val="false"/>
-                <w:strike w:val="false"/>
-                <w:dstrike w:val="false"/>
-                <w:color w:val="000000"/>
-                <w:position w:val="0"/>
-                <w:sz w:val="24"/>
+                <w:caps w:val="false"/>
+                <w:smallCaps w:val="false"/>
+                <w:strike w:val="false"/>
+                <w:dstrike w:val="false"/>
+                <w:color w:val="000000"/>
+                <w:position w:val="0"/>
                 <w:sz w:val="24"/>
                 <w:szCs w:val="24"/>
                 <w:u w:val="none"/>
@@ -6141,7 +6283,6 @@
                 <w:dstrike w:val="false"/>
                 <w:color w:val="000000"/>
                 <w:position w:val="0"/>
-                <w:sz w:val="24"/>
                 <w:sz w:val="24"/>
                 <w:szCs w:val="24"/>
                 <w:u w:val="none"/>
@@ -6174,14 +6315,12 @@
                 <w:rFonts w:ascii="Arial" w:hAnsi="Arial" w:eastAsia="Times New Roman" w:cs="Times New Roman"/>
                 <w:b w:val="false"/>
                 <w:i w:val="false"/>
-                <w:i w:val="false"/>
-                <w:caps w:val="false"/>
-                <w:smallCaps w:val="false"/>
-                <w:strike w:val="false"/>
-                <w:dstrike w:val="false"/>
-                <w:color w:val="000000"/>
-                <w:position w:val="0"/>
-                <w:sz w:val="24"/>
+                <w:caps w:val="false"/>
+                <w:smallCaps w:val="false"/>
+                <w:strike w:val="false"/>
+                <w:dstrike w:val="false"/>
+                <w:color w:val="000000"/>
+                <w:position w:val="0"/>
                 <w:sz w:val="24"/>
                 <w:szCs w:val="24"/>
                 <w:u w:val="none"/>
@@ -6200,7 +6339,6 @@
                 <w:dstrike w:val="false"/>
                 <w:color w:val="000000"/>
                 <w:position w:val="0"/>
-                <w:sz w:val="24"/>
                 <w:sz w:val="24"/>
                 <w:szCs w:val="24"/>
                 <w:u w:val="none"/>
@@ -6223,14 +6361,12 @@
                 <w:rFonts w:ascii="Arial" w:hAnsi="Arial" w:eastAsia="Times New Roman" w:cs="Times New Roman"/>
                 <w:b w:val="false"/>
                 <w:i w:val="false"/>
-                <w:i w:val="false"/>
-                <w:caps w:val="false"/>
-                <w:smallCaps w:val="false"/>
-                <w:strike w:val="false"/>
-                <w:dstrike w:val="false"/>
-                <w:color w:val="000000"/>
-                <w:position w:val="0"/>
-                <w:sz w:val="24"/>
+                <w:caps w:val="false"/>
+                <w:smallCaps w:val="false"/>
+                <w:strike w:val="false"/>
+                <w:dstrike w:val="false"/>
+                <w:color w:val="000000"/>
+                <w:position w:val="0"/>
                 <w:sz w:val="24"/>
                 <w:szCs w:val="24"/>
                 <w:u w:val="none"/>
@@ -6249,7 +6385,6 @@
                 <w:dstrike w:val="false"/>
                 <w:color w:val="000000"/>
                 <w:position w:val="0"/>
-                <w:sz w:val="24"/>
                 <w:sz w:val="24"/>
                 <w:szCs w:val="24"/>
                 <w:u w:val="none"/>
@@ -6359,14 +6494,12 @@
                 <w:rFonts w:ascii="Arial" w:hAnsi="Arial" w:eastAsia="Times New Roman" w:cs="Times New Roman"/>
                 <w:b w:val="false"/>
                 <w:i w:val="false"/>
-                <w:i w:val="false"/>
-                <w:caps w:val="false"/>
-                <w:smallCaps w:val="false"/>
-                <w:strike w:val="false"/>
-                <w:dstrike w:val="false"/>
-                <w:color w:val="000000"/>
-                <w:position w:val="0"/>
-                <w:sz w:val="24"/>
+                <w:caps w:val="false"/>
+                <w:smallCaps w:val="false"/>
+                <w:strike w:val="false"/>
+                <w:dstrike w:val="false"/>
+                <w:color w:val="000000"/>
+                <w:position w:val="0"/>
                 <w:sz w:val="24"/>
                 <w:szCs w:val="24"/>
                 <w:u w:val="none"/>
@@ -6385,7 +6518,6 @@
                 <w:dstrike w:val="false"/>
                 <w:color w:val="000000"/>
                 <w:position w:val="0"/>
-                <w:sz w:val="24"/>
                 <w:sz w:val="24"/>
                 <w:szCs w:val="24"/>
                 <w:u w:val="none"/>
@@ -6408,14 +6540,12 @@
                 <w:rFonts w:ascii="Arial" w:hAnsi="Arial" w:eastAsia="Times New Roman" w:cs="Times New Roman"/>
                 <w:b w:val="false"/>
                 <w:i w:val="false"/>
-                <w:i w:val="false"/>
-                <w:caps w:val="false"/>
-                <w:smallCaps w:val="false"/>
-                <w:strike w:val="false"/>
-                <w:dstrike w:val="false"/>
-                <w:color w:val="000000"/>
-                <w:position w:val="0"/>
-                <w:sz w:val="24"/>
+                <w:caps w:val="false"/>
+                <w:smallCaps w:val="false"/>
+                <w:strike w:val="false"/>
+                <w:dstrike w:val="false"/>
+                <w:color w:val="000000"/>
+                <w:position w:val="0"/>
                 <w:sz w:val="24"/>
                 <w:szCs w:val="24"/>
                 <w:u w:val="none"/>
@@ -6434,7 +6564,6 @@
                 <w:dstrike w:val="false"/>
                 <w:color w:val="000000"/>
                 <w:position w:val="0"/>
-                <w:sz w:val="24"/>
                 <w:sz w:val="24"/>
                 <w:szCs w:val="24"/>
                 <w:u w:val="none"/>
@@ -6517,14 +6646,12 @@
                 <w:rFonts w:ascii="Arial" w:hAnsi="Arial" w:eastAsia="Times New Roman" w:cs="Times New Roman"/>
                 <w:b w:val="false"/>
                 <w:i w:val="false"/>
-                <w:i w:val="false"/>
-                <w:caps w:val="false"/>
-                <w:smallCaps w:val="false"/>
-                <w:strike w:val="false"/>
-                <w:dstrike w:val="false"/>
-                <w:color w:val="000000"/>
-                <w:position w:val="0"/>
-                <w:sz w:val="24"/>
+                <w:caps w:val="false"/>
+                <w:smallCaps w:val="false"/>
+                <w:strike w:val="false"/>
+                <w:dstrike w:val="false"/>
+                <w:color w:val="000000"/>
+                <w:position w:val="0"/>
                 <w:sz w:val="24"/>
                 <w:szCs w:val="24"/>
                 <w:u w:val="none"/>
@@ -6543,7 +6670,6 @@
                 <w:dstrike w:val="false"/>
                 <w:color w:val="000000"/>
                 <w:position w:val="0"/>
-                <w:sz w:val="24"/>
                 <w:sz w:val="24"/>
                 <w:szCs w:val="24"/>
                 <w:u w:val="none"/>
@@ -6566,14 +6692,12 @@
                 <w:rFonts w:ascii="Arial" w:hAnsi="Arial" w:eastAsia="Times New Roman" w:cs="Times New Roman"/>
                 <w:b w:val="false"/>
                 <w:i w:val="false"/>
-                <w:i w:val="false"/>
-                <w:caps w:val="false"/>
-                <w:smallCaps w:val="false"/>
-                <w:strike w:val="false"/>
-                <w:dstrike w:val="false"/>
-                <w:color w:val="000000"/>
-                <w:position w:val="0"/>
-                <w:sz w:val="24"/>
+                <w:caps w:val="false"/>
+                <w:smallCaps w:val="false"/>
+                <w:strike w:val="false"/>
+                <w:dstrike w:val="false"/>
+                <w:color w:val="000000"/>
+                <w:position w:val="0"/>
                 <w:sz w:val="24"/>
                 <w:szCs w:val="24"/>
                 <w:u w:val="none"/>
@@ -6592,7 +6716,6 @@
                 <w:dstrike w:val="false"/>
                 <w:color w:val="000000"/>
                 <w:position w:val="0"/>
-                <w:sz w:val="24"/>
                 <w:sz w:val="24"/>
                 <w:szCs w:val="24"/>
                 <w:u w:val="none"/>
@@ -6720,14 +6843,12 @@
                 <w:rFonts w:ascii="Arial" w:hAnsi="Arial" w:eastAsia="Times New Roman" w:cs="Times New Roman"/>
                 <w:b w:val="false"/>
                 <w:i w:val="false"/>
-                <w:i w:val="false"/>
-                <w:caps w:val="false"/>
-                <w:smallCaps w:val="false"/>
-                <w:strike w:val="false"/>
-                <w:dstrike w:val="false"/>
-                <w:color w:val="000000"/>
-                <w:position w:val="0"/>
-                <w:sz w:val="24"/>
+                <w:caps w:val="false"/>
+                <w:smallCaps w:val="false"/>
+                <w:strike w:val="false"/>
+                <w:dstrike w:val="false"/>
+                <w:color w:val="000000"/>
+                <w:position w:val="0"/>
                 <w:sz w:val="24"/>
                 <w:szCs w:val="24"/>
                 <w:u w:val="none"/>
@@ -6746,7 +6867,6 @@
                 <w:dstrike w:val="false"/>
                 <w:color w:val="000000"/>
                 <w:position w:val="0"/>
-                <w:sz w:val="24"/>
                 <w:sz w:val="24"/>
                 <w:szCs w:val="24"/>
                 <w:u w:val="none"/>
@@ -6769,14 +6889,12 @@
                 <w:rFonts w:ascii="Arial" w:hAnsi="Arial" w:eastAsia="Times New Roman" w:cs="Times New Roman"/>
                 <w:b w:val="false"/>
                 <w:i w:val="false"/>
-                <w:i w:val="false"/>
-                <w:caps w:val="false"/>
-                <w:smallCaps w:val="false"/>
-                <w:strike w:val="false"/>
-                <w:dstrike w:val="false"/>
-                <w:color w:val="000000"/>
-                <w:position w:val="0"/>
-                <w:sz w:val="24"/>
+                <w:caps w:val="false"/>
+                <w:smallCaps w:val="false"/>
+                <w:strike w:val="false"/>
+                <w:dstrike w:val="false"/>
+                <w:color w:val="000000"/>
+                <w:position w:val="0"/>
                 <w:sz w:val="24"/>
                 <w:szCs w:val="24"/>
                 <w:u w:val="none"/>
@@ -6795,7 +6913,6 @@
                 <w:dstrike w:val="false"/>
                 <w:color w:val="000000"/>
                 <w:position w:val="0"/>
-                <w:sz w:val="24"/>
                 <w:sz w:val="24"/>
                 <w:szCs w:val="24"/>
                 <w:u w:val="none"/>
@@ -6833,7 +6950,6 @@
                 <w:color w:val="000000"/>
                 <w:position w:val="0"/>
                 <w:sz w:val="24"/>
-                <w:sz w:val="24"/>
                 <w:szCs w:val="24"/>
                 <w:u w:val="none"/>
                 <w:shd w:fill="auto" w:val="clear"/>
@@ -6853,7 +6969,6 @@
                 <w:dstrike w:val="false"/>
                 <w:color w:val="000000"/>
                 <w:position w:val="0"/>
-                <w:sz w:val="24"/>
                 <w:sz w:val="24"/>
                 <w:szCs w:val="24"/>
                 <w:u w:val="none"/>
@@ -6894,7 +7009,7 @@
         </w:tc>
         <w:tc>
           <w:tcPr>
-            <w:tcW w:w="2651" w:type="dxa"/>
+            <w:tcW w:w="2652" w:type="dxa"/>
             <w:tcBorders>
               <w:left w:val="single" w:sz="4" w:space="0" w:color="000000"/>
               <w:bottom w:val="single" w:sz="4" w:space="0" w:color="000000"/>
@@ -6915,14 +7030,12 @@
                 <w:rFonts w:ascii="Arial" w:hAnsi="Arial" w:eastAsia="Times New Roman" w:cs="Times New Roman"/>
                 <w:b w:val="false"/>
                 <w:i w:val="false"/>
-                <w:i w:val="false"/>
-                <w:caps w:val="false"/>
-                <w:smallCaps w:val="false"/>
-                <w:strike w:val="false"/>
-                <w:dstrike w:val="false"/>
-                <w:color w:val="000000"/>
-                <w:position w:val="0"/>
-                <w:sz w:val="24"/>
+                <w:caps w:val="false"/>
+                <w:smallCaps w:val="false"/>
+                <w:strike w:val="false"/>
+                <w:dstrike w:val="false"/>
+                <w:color w:val="000000"/>
+                <w:position w:val="0"/>
                 <w:sz w:val="24"/>
                 <w:szCs w:val="24"/>
                 <w:u w:val="none"/>
@@ -6941,7 +7054,6 @@
                 <w:dstrike w:val="false"/>
                 <w:color w:val="000000"/>
                 <w:position w:val="0"/>
-                <w:sz w:val="24"/>
                 <w:sz w:val="24"/>
                 <w:szCs w:val="24"/>
                 <w:u w:val="none"/>
@@ -6964,14 +7076,12 @@
                 <w:rFonts w:ascii="Arial" w:hAnsi="Arial" w:eastAsia="Times New Roman" w:cs="Times New Roman"/>
                 <w:b w:val="false"/>
                 <w:i w:val="false"/>
-                <w:i w:val="false"/>
-                <w:caps w:val="false"/>
-                <w:smallCaps w:val="false"/>
-                <w:strike w:val="false"/>
-                <w:dstrike w:val="false"/>
-                <w:color w:val="000000"/>
-                <w:position w:val="0"/>
-                <w:sz w:val="24"/>
+                <w:caps w:val="false"/>
+                <w:smallCaps w:val="false"/>
+                <w:strike w:val="false"/>
+                <w:dstrike w:val="false"/>
+                <w:color w:val="000000"/>
+                <w:position w:val="0"/>
                 <w:sz w:val="24"/>
                 <w:szCs w:val="24"/>
                 <w:u w:val="none"/>
@@ -6990,7 +7100,6 @@
                 <w:dstrike w:val="false"/>
                 <w:color w:val="000000"/>
                 <w:position w:val="0"/>
-                <w:sz w:val="24"/>
                 <w:sz w:val="24"/>
                 <w:szCs w:val="24"/>
                 <w:u w:val="none"/>
@@ -7068,14 +7177,12 @@
                 <w:rFonts w:ascii="Arial" w:hAnsi="Arial" w:eastAsia="Times New Roman" w:cs="Times New Roman"/>
                 <w:b w:val="false"/>
                 <w:i w:val="false"/>
-                <w:i w:val="false"/>
-                <w:caps w:val="false"/>
-                <w:smallCaps w:val="false"/>
-                <w:strike w:val="false"/>
-                <w:dstrike w:val="false"/>
-                <w:color w:val="000000"/>
-                <w:position w:val="0"/>
-                <w:sz w:val="24"/>
+                <w:caps w:val="false"/>
+                <w:smallCaps w:val="false"/>
+                <w:strike w:val="false"/>
+                <w:dstrike w:val="false"/>
+                <w:color w:val="000000"/>
+                <w:position w:val="0"/>
                 <w:sz w:val="24"/>
                 <w:szCs w:val="24"/>
                 <w:u w:val="none"/>
@@ -7094,7 +7201,6 @@
                 <w:dstrike w:val="false"/>
                 <w:color w:val="000000"/>
                 <w:position w:val="0"/>
-                <w:sz w:val="24"/>
                 <w:sz w:val="24"/>
                 <w:szCs w:val="24"/>
                 <w:u w:val="none"/>
@@ -7128,14 +7234,12 @@
                 <w:rFonts w:ascii="Arial" w:hAnsi="Arial" w:eastAsia="Times New Roman" w:cs="Times New Roman"/>
                 <w:b w:val="false"/>
                 <w:i w:val="false"/>
-                <w:i w:val="false"/>
-                <w:caps w:val="false"/>
-                <w:smallCaps w:val="false"/>
-                <w:strike w:val="false"/>
-                <w:dstrike w:val="false"/>
-                <w:color w:val="000000"/>
-                <w:position w:val="0"/>
-                <w:sz w:val="24"/>
+                <w:caps w:val="false"/>
+                <w:smallCaps w:val="false"/>
+                <w:strike w:val="false"/>
+                <w:dstrike w:val="false"/>
+                <w:color w:val="000000"/>
+                <w:position w:val="0"/>
                 <w:sz w:val="24"/>
                 <w:szCs w:val="24"/>
                 <w:u w:val="none"/>
@@ -7154,7 +7258,6 @@
                 <w:dstrike w:val="false"/>
                 <w:color w:val="000000"/>
                 <w:position w:val="0"/>
-                <w:sz w:val="24"/>
                 <w:sz w:val="24"/>
                 <w:szCs w:val="24"/>
                 <w:u w:val="none"/>
@@ -7177,14 +7280,12 @@
                 <w:rFonts w:ascii="Arial" w:hAnsi="Arial" w:eastAsia="Times New Roman" w:cs="Times New Roman"/>
                 <w:b w:val="false"/>
                 <w:i w:val="false"/>
-                <w:i w:val="false"/>
-                <w:caps w:val="false"/>
-                <w:smallCaps w:val="false"/>
-                <w:strike w:val="false"/>
-                <w:dstrike w:val="false"/>
-                <w:color w:val="000000"/>
-                <w:position w:val="0"/>
-                <w:sz w:val="24"/>
+                <w:caps w:val="false"/>
+                <w:smallCaps w:val="false"/>
+                <w:strike w:val="false"/>
+                <w:dstrike w:val="false"/>
+                <w:color w:val="000000"/>
+                <w:position w:val="0"/>
                 <w:sz w:val="24"/>
                 <w:szCs w:val="24"/>
                 <w:u w:val="none"/>
@@ -7203,7 +7304,6 @@
                 <w:dstrike w:val="false"/>
                 <w:color w:val="000000"/>
                 <w:position w:val="0"/>
-                <w:sz w:val="24"/>
                 <w:sz w:val="24"/>
                 <w:szCs w:val="24"/>
                 <w:u w:val="none"/>
@@ -7265,14 +7365,12 @@
                 <w:rFonts w:ascii="Arial" w:hAnsi="Arial" w:eastAsia="Times New Roman" w:cs="Times New Roman"/>
                 <w:b w:val="false"/>
                 <w:i w:val="false"/>
-                <w:i w:val="false"/>
-                <w:caps w:val="false"/>
-                <w:smallCaps w:val="false"/>
-                <w:strike w:val="false"/>
-                <w:dstrike w:val="false"/>
-                <w:color w:val="000000"/>
-                <w:position w:val="0"/>
-                <w:sz w:val="24"/>
+                <w:caps w:val="false"/>
+                <w:smallCaps w:val="false"/>
+                <w:strike w:val="false"/>
+                <w:dstrike w:val="false"/>
+                <w:color w:val="000000"/>
+                <w:position w:val="0"/>
                 <w:sz w:val="24"/>
                 <w:szCs w:val="24"/>
                 <w:u w:val="none"/>
@@ -7291,7 +7389,6 @@
                 <w:dstrike w:val="false"/>
                 <w:color w:val="000000"/>
                 <w:position w:val="0"/>
-                <w:sz w:val="24"/>
                 <w:sz w:val="24"/>
                 <w:szCs w:val="24"/>
                 <w:u w:val="none"/>
@@ -7314,14 +7411,12 @@
                 <w:rFonts w:ascii="Arial" w:hAnsi="Arial" w:eastAsia="Times New Roman" w:cs="Times New Roman"/>
                 <w:b w:val="false"/>
                 <w:i w:val="false"/>
-                <w:i w:val="false"/>
-                <w:caps w:val="false"/>
-                <w:smallCaps w:val="false"/>
-                <w:strike w:val="false"/>
-                <w:dstrike w:val="false"/>
-                <w:color w:val="000000"/>
-                <w:position w:val="0"/>
-                <w:sz w:val="24"/>
+                <w:caps w:val="false"/>
+                <w:smallCaps w:val="false"/>
+                <w:strike w:val="false"/>
+                <w:dstrike w:val="false"/>
+                <w:color w:val="000000"/>
+                <w:position w:val="0"/>
                 <w:sz w:val="24"/>
                 <w:szCs w:val="24"/>
                 <w:u w:val="none"/>
@@ -7340,7 +7435,6 @@
                 <w:dstrike w:val="false"/>
                 <w:color w:val="000000"/>
                 <w:position w:val="0"/>
-                <w:sz w:val="24"/>
                 <w:sz w:val="24"/>
                 <w:szCs w:val="24"/>
                 <w:u w:val="none"/>
@@ -7402,14 +7496,12 @@
                 <w:rFonts w:ascii="Arial" w:hAnsi="Arial" w:eastAsia="Times New Roman" w:cs="Times New Roman"/>
                 <w:b w:val="false"/>
                 <w:i w:val="false"/>
-                <w:i w:val="false"/>
-                <w:caps w:val="false"/>
-                <w:smallCaps w:val="false"/>
-                <w:strike w:val="false"/>
-                <w:dstrike w:val="false"/>
-                <w:color w:val="000000"/>
-                <w:position w:val="0"/>
-                <w:sz w:val="24"/>
+                <w:caps w:val="false"/>
+                <w:smallCaps w:val="false"/>
+                <w:strike w:val="false"/>
+                <w:dstrike w:val="false"/>
+                <w:color w:val="000000"/>
+                <w:position w:val="0"/>
                 <w:sz w:val="24"/>
                 <w:szCs w:val="24"/>
                 <w:u w:val="none"/>
@@ -7428,7 +7520,6 @@
                 <w:dstrike w:val="false"/>
                 <w:color w:val="000000"/>
                 <w:position w:val="0"/>
-                <w:sz w:val="24"/>
                 <w:sz w:val="24"/>
                 <w:szCs w:val="24"/>
                 <w:u w:val="none"/>
@@ -7451,14 +7542,12 @@
                 <w:rFonts w:ascii="Arial" w:hAnsi="Arial" w:eastAsia="Times New Roman" w:cs="Times New Roman"/>
                 <w:b w:val="false"/>
                 <w:i w:val="false"/>
-                <w:i w:val="false"/>
-                <w:caps w:val="false"/>
-                <w:smallCaps w:val="false"/>
-                <w:strike w:val="false"/>
-                <w:dstrike w:val="false"/>
-                <w:color w:val="000000"/>
-                <w:position w:val="0"/>
-                <w:sz w:val="24"/>
+                <w:caps w:val="false"/>
+                <w:smallCaps w:val="false"/>
+                <w:strike w:val="false"/>
+                <w:dstrike w:val="false"/>
+                <w:color w:val="000000"/>
+                <w:position w:val="0"/>
                 <w:sz w:val="24"/>
                 <w:szCs w:val="24"/>
                 <w:u w:val="none"/>
@@ -7477,7 +7566,6 @@
                 <w:dstrike w:val="false"/>
                 <w:color w:val="000000"/>
                 <w:position w:val="0"/>
-                <w:sz w:val="24"/>
                 <w:sz w:val="24"/>
                 <w:szCs w:val="24"/>
                 <w:u w:val="none"/>
@@ -7500,14 +7588,12 @@
                 <w:rFonts w:ascii="Arial" w:hAnsi="Arial" w:eastAsia="Times New Roman" w:cs="Times New Roman"/>
                 <w:b w:val="false"/>
                 <w:i w:val="false"/>
-                <w:i w:val="false"/>
-                <w:caps w:val="false"/>
-                <w:smallCaps w:val="false"/>
-                <w:strike w:val="false"/>
-                <w:dstrike w:val="false"/>
-                <w:color w:val="000000"/>
-                <w:position w:val="0"/>
-                <w:sz w:val="24"/>
+                <w:caps w:val="false"/>
+                <w:smallCaps w:val="false"/>
+                <w:strike w:val="false"/>
+                <w:dstrike w:val="false"/>
+                <w:color w:val="000000"/>
+                <w:position w:val="0"/>
                 <w:sz w:val="24"/>
                 <w:szCs w:val="24"/>
                 <w:u w:val="none"/>
@@ -7526,7 +7612,6 @@
                 <w:dstrike w:val="false"/>
                 <w:color w:val="000000"/>
                 <w:position w:val="0"/>
-                <w:sz w:val="24"/>
                 <w:sz w:val="24"/>
                 <w:szCs w:val="24"/>
                 <w:u w:val="none"/>
@@ -7574,7 +7659,6 @@
                 <w:color w:val="000000"/>
                 <w:position w:val="0"/>
                 <w:sz w:val="24"/>
-                <w:sz w:val="24"/>
                 <w:szCs w:val="24"/>
                 <w:u w:val="none"/>
                 <w:shd w:fill="auto" w:val="clear"/>
@@ -7608,14 +7692,12 @@
                 <w:rFonts w:ascii="Arial" w:hAnsi="Arial" w:eastAsia="Times New Roman" w:cs="Times New Roman"/>
                 <w:b w:val="false"/>
                 <w:i w:val="false"/>
-                <w:i w:val="false"/>
-                <w:caps w:val="false"/>
-                <w:smallCaps w:val="false"/>
-                <w:strike w:val="false"/>
-                <w:dstrike w:val="false"/>
-                <w:color w:val="000000"/>
-                <w:position w:val="0"/>
-                <w:sz w:val="24"/>
+                <w:caps w:val="false"/>
+                <w:smallCaps w:val="false"/>
+                <w:strike w:val="false"/>
+                <w:dstrike w:val="false"/>
+                <w:color w:val="000000"/>
+                <w:position w:val="0"/>
                 <w:sz w:val="24"/>
                 <w:szCs w:val="24"/>
                 <w:u w:val="none"/>
@@ -7634,7 +7716,6 @@
                 <w:dstrike w:val="false"/>
                 <w:color w:val="000000"/>
                 <w:position w:val="0"/>
-                <w:sz w:val="24"/>
                 <w:sz w:val="24"/>
                 <w:szCs w:val="24"/>
                 <w:u w:val="none"/>
@@ -7657,14 +7738,12 @@
                 <w:rFonts w:ascii="Arial" w:hAnsi="Arial" w:eastAsia="Times New Roman" w:cs="Times New Roman"/>
                 <w:b w:val="false"/>
                 <w:i w:val="false"/>
-                <w:i w:val="false"/>
-                <w:caps w:val="false"/>
-                <w:smallCaps w:val="false"/>
-                <w:strike w:val="false"/>
-                <w:dstrike w:val="false"/>
-                <w:color w:val="000000"/>
-                <w:position w:val="0"/>
-                <w:sz w:val="24"/>
+                <w:caps w:val="false"/>
+                <w:smallCaps w:val="false"/>
+                <w:strike w:val="false"/>
+                <w:dstrike w:val="false"/>
+                <w:color w:val="000000"/>
+                <w:position w:val="0"/>
                 <w:sz w:val="24"/>
                 <w:szCs w:val="24"/>
                 <w:u w:val="none"/>
@@ -7683,7 +7762,6 @@
                 <w:dstrike w:val="false"/>
                 <w:color w:val="000000"/>
                 <w:position w:val="0"/>
-                <w:sz w:val="24"/>
                 <w:sz w:val="24"/>
                 <w:szCs w:val="24"/>
                 <w:u w:val="none"/>
@@ -7706,14 +7784,12 @@
                 <w:rFonts w:ascii="Arial" w:hAnsi="Arial" w:eastAsia="Times New Roman" w:cs="Times New Roman"/>
                 <w:b w:val="false"/>
                 <w:i w:val="false"/>
-                <w:i w:val="false"/>
-                <w:caps w:val="false"/>
-                <w:smallCaps w:val="false"/>
-                <w:strike w:val="false"/>
-                <w:dstrike w:val="false"/>
-                <w:color w:val="000000"/>
-                <w:position w:val="0"/>
-                <w:sz w:val="24"/>
+                <w:caps w:val="false"/>
+                <w:smallCaps w:val="false"/>
+                <w:strike w:val="false"/>
+                <w:dstrike w:val="false"/>
+                <w:color w:val="000000"/>
+                <w:position w:val="0"/>
                 <w:sz w:val="24"/>
                 <w:szCs w:val="24"/>
                 <w:u w:val="none"/>
@@ -7732,7 +7808,6 @@
                 <w:dstrike w:val="false"/>
                 <w:color w:val="000000"/>
                 <w:position w:val="0"/>
-                <w:sz w:val="24"/>
                 <w:sz w:val="24"/>
                 <w:szCs w:val="24"/>
                 <w:u w:val="none"/>
@@ -7770,7 +7845,6 @@
                 <w:color w:val="000000"/>
                 <w:position w:val="0"/>
                 <w:sz w:val="24"/>
-                <w:sz w:val="24"/>
                 <w:szCs w:val="24"/>
                 <w:u w:val="none"/>
                 <w:shd w:fill="auto" w:val="clear"/>
@@ -7792,7 +7866,7 @@
         </w:tc>
         <w:tc>
           <w:tcPr>
-            <w:tcW w:w="2651" w:type="dxa"/>
+            <w:tcW w:w="2652" w:type="dxa"/>
             <w:tcBorders>
               <w:top w:val="single" w:sz="4" w:space="0" w:color="000000"/>
               <w:left w:val="single" w:sz="4" w:space="0" w:color="000000"/>
@@ -7814,14 +7888,12 @@
                 <w:rFonts w:ascii="Arial" w:hAnsi="Arial" w:eastAsia="Times New Roman" w:cs="Times New Roman"/>
                 <w:b w:val="false"/>
                 <w:i w:val="false"/>
-                <w:i w:val="false"/>
-                <w:caps w:val="false"/>
-                <w:smallCaps w:val="false"/>
-                <w:strike w:val="false"/>
-                <w:dstrike w:val="false"/>
-                <w:color w:val="000000"/>
-                <w:position w:val="0"/>
-                <w:sz w:val="24"/>
+                <w:caps w:val="false"/>
+                <w:smallCaps w:val="false"/>
+                <w:strike w:val="false"/>
+                <w:dstrike w:val="false"/>
+                <w:color w:val="000000"/>
+                <w:position w:val="0"/>
                 <w:sz w:val="24"/>
                 <w:szCs w:val="24"/>
                 <w:u w:val="none"/>
@@ -7840,7 +7912,6 @@
                 <w:dstrike w:val="false"/>
                 <w:color w:val="000000"/>
                 <w:position w:val="0"/>
-                <w:sz w:val="24"/>
                 <w:sz w:val="24"/>
                 <w:szCs w:val="24"/>
                 <w:u w:val="none"/>
@@ -7863,14 +7934,12 @@
                 <w:rFonts w:ascii="Arial" w:hAnsi="Arial" w:eastAsia="Times New Roman" w:cs="Times New Roman"/>
                 <w:b w:val="false"/>
                 <w:i w:val="false"/>
-                <w:i w:val="false"/>
-                <w:caps w:val="false"/>
-                <w:smallCaps w:val="false"/>
-                <w:strike w:val="false"/>
-                <w:dstrike w:val="false"/>
-                <w:color w:val="000000"/>
-                <w:position w:val="0"/>
-                <w:sz w:val="24"/>
+                <w:caps w:val="false"/>
+                <w:smallCaps w:val="false"/>
+                <w:strike w:val="false"/>
+                <w:dstrike w:val="false"/>
+                <w:color w:val="000000"/>
+                <w:position w:val="0"/>
                 <w:sz w:val="24"/>
                 <w:szCs w:val="24"/>
                 <w:u w:val="none"/>
@@ -7889,7 +7958,6 @@
                 <w:dstrike w:val="false"/>
                 <w:color w:val="000000"/>
                 <w:position w:val="0"/>
-                <w:sz w:val="24"/>
                 <w:sz w:val="24"/>
                 <w:szCs w:val="24"/>
                 <w:u w:val="none"/>
@@ -7912,14 +7980,12 @@
                 <w:rFonts w:ascii="Arial" w:hAnsi="Arial" w:eastAsia="Times New Roman" w:cs="Times New Roman"/>
                 <w:b w:val="false"/>
                 <w:i w:val="false"/>
-                <w:i w:val="false"/>
-                <w:caps w:val="false"/>
-                <w:smallCaps w:val="false"/>
-                <w:strike w:val="false"/>
-                <w:dstrike w:val="false"/>
-                <w:color w:val="000000"/>
-                <w:position w:val="0"/>
-                <w:sz w:val="24"/>
+                <w:caps w:val="false"/>
+                <w:smallCaps w:val="false"/>
+                <w:strike w:val="false"/>
+                <w:dstrike w:val="false"/>
+                <w:color w:val="000000"/>
+                <w:position w:val="0"/>
                 <w:sz w:val="24"/>
                 <w:szCs w:val="24"/>
                 <w:u w:val="none"/>
@@ -7938,7 +8004,6 @@
                 <w:dstrike w:val="false"/>
                 <w:color w:val="000000"/>
                 <w:position w:val="0"/>
-                <w:sz w:val="24"/>
                 <w:sz w:val="24"/>
                 <w:szCs w:val="24"/>
                 <w:u w:val="none"/>
@@ -7999,14 +8064,12 @@
                 <w:rFonts w:ascii="Arial" w:hAnsi="Arial" w:eastAsia="Times New Roman" w:cs="Times New Roman"/>
                 <w:b w:val="false"/>
                 <w:i w:val="false"/>
-                <w:i w:val="false"/>
-                <w:caps w:val="false"/>
-                <w:smallCaps w:val="false"/>
-                <w:strike w:val="false"/>
-                <w:dstrike w:val="false"/>
-                <w:color w:val="000000"/>
-                <w:position w:val="0"/>
-                <w:sz w:val="24"/>
+                <w:caps w:val="false"/>
+                <w:smallCaps w:val="false"/>
+                <w:strike w:val="false"/>
+                <w:dstrike w:val="false"/>
+                <w:color w:val="000000"/>
+                <w:position w:val="0"/>
                 <w:sz w:val="24"/>
                 <w:szCs w:val="24"/>
                 <w:u w:val="none"/>
@@ -8025,7 +8088,6 @@
                 <w:dstrike w:val="false"/>
                 <w:color w:val="000000"/>
                 <w:position w:val="0"/>
-                <w:sz w:val="24"/>
                 <w:sz w:val="24"/>
                 <w:szCs w:val="24"/>
                 <w:u w:val="none"/>
@@ -8059,14 +8121,12 @@
                 <w:rFonts w:ascii="Arial" w:hAnsi="Arial" w:eastAsia="Times New Roman" w:cs="Times New Roman"/>
                 <w:b w:val="false"/>
                 <w:i w:val="false"/>
-                <w:i w:val="false"/>
-                <w:caps w:val="false"/>
-                <w:smallCaps w:val="false"/>
-                <w:strike w:val="false"/>
-                <w:dstrike w:val="false"/>
-                <w:color w:val="000000"/>
-                <w:position w:val="0"/>
-                <w:sz w:val="24"/>
+                <w:caps w:val="false"/>
+                <w:smallCaps w:val="false"/>
+                <w:strike w:val="false"/>
+                <w:dstrike w:val="false"/>
+                <w:color w:val="000000"/>
+                <w:position w:val="0"/>
                 <w:sz w:val="24"/>
                 <w:szCs w:val="24"/>
                 <w:u w:val="none"/>
@@ -8085,7 +8145,6 @@
                 <w:dstrike w:val="false"/>
                 <w:color w:val="000000"/>
                 <w:position w:val="0"/>
-                <w:sz w:val="24"/>
                 <w:sz w:val="24"/>
                 <w:szCs w:val="24"/>
                 <w:u w:val="none"/>
@@ -8231,14 +8290,12 @@
                 <w:rFonts w:ascii="Arial" w:hAnsi="Arial" w:eastAsia="Arial" w:cs="Arial"/>
                 <w:b/>
                 <w:i w:val="false"/>
-                <w:i w:val="false"/>
-                <w:caps w:val="false"/>
-                <w:smallCaps w:val="false"/>
-                <w:strike w:val="false"/>
-                <w:dstrike w:val="false"/>
-                <w:color w:val="000000"/>
-                <w:position w:val="0"/>
-                <w:sz w:val="24"/>
+                <w:caps w:val="false"/>
+                <w:smallCaps w:val="false"/>
+                <w:strike w:val="false"/>
+                <w:dstrike w:val="false"/>
+                <w:color w:val="000000"/>
+                <w:position w:val="0"/>
                 <w:sz w:val="24"/>
                 <w:szCs w:val="24"/>
                 <w:u w:val="none"/>
@@ -8257,7 +8314,6 @@
                 <w:dstrike w:val="false"/>
                 <w:color w:val="000000"/>
                 <w:position w:val="0"/>
-                <w:sz w:val="24"/>
                 <w:sz w:val="24"/>
                 <w:szCs w:val="24"/>
                 <w:u w:val="none"/>
@@ -8364,14 +8420,12 @@
                 <w:rFonts w:ascii="Arial" w:hAnsi="Arial" w:eastAsia="Times New Roman" w:cs="Times New Roman"/>
                 <w:b w:val="false"/>
                 <w:i w:val="false"/>
-                <w:i w:val="false"/>
-                <w:caps w:val="false"/>
-                <w:smallCaps w:val="false"/>
-                <w:strike w:val="false"/>
-                <w:dstrike w:val="false"/>
-                <w:color w:val="000000"/>
-                <w:position w:val="0"/>
-                <w:sz w:val="24"/>
+                <w:caps w:val="false"/>
+                <w:smallCaps w:val="false"/>
+                <w:strike w:val="false"/>
+                <w:dstrike w:val="false"/>
+                <w:color w:val="000000"/>
+                <w:position w:val="0"/>
                 <w:sz w:val="24"/>
                 <w:szCs w:val="24"/>
                 <w:u w:val="none"/>
@@ -8390,7 +8444,6 @@
                 <w:dstrike w:val="false"/>
                 <w:color w:val="000000"/>
                 <w:position w:val="0"/>
-                <w:sz w:val="24"/>
                 <w:sz w:val="24"/>
                 <w:szCs w:val="24"/>
                 <w:u w:val="none"/>
@@ -8413,14 +8466,12 @@
                 <w:rFonts w:ascii="Arial" w:hAnsi="Arial" w:eastAsia="Times New Roman" w:cs="Times New Roman"/>
                 <w:b w:val="false"/>
                 <w:i w:val="false"/>
-                <w:i w:val="false"/>
-                <w:caps w:val="false"/>
-                <w:smallCaps w:val="false"/>
-                <w:strike w:val="false"/>
-                <w:dstrike w:val="false"/>
-                <w:color w:val="000000"/>
-                <w:position w:val="0"/>
-                <w:sz w:val="24"/>
+                <w:caps w:val="false"/>
+                <w:smallCaps w:val="false"/>
+                <w:strike w:val="false"/>
+                <w:dstrike w:val="false"/>
+                <w:color w:val="000000"/>
+                <w:position w:val="0"/>
                 <w:sz w:val="24"/>
                 <w:szCs w:val="24"/>
                 <w:u w:val="none"/>
@@ -8439,7 +8490,6 @@
                 <w:dstrike w:val="false"/>
                 <w:color w:val="000000"/>
                 <w:position w:val="0"/>
-                <w:sz w:val="24"/>
                 <w:sz w:val="24"/>
                 <w:szCs w:val="24"/>
                 <w:u w:val="none"/>
@@ -8462,14 +8512,12 @@
                 <w:rFonts w:ascii="Arial" w:hAnsi="Arial" w:eastAsia="Times New Roman" w:cs="Times New Roman"/>
                 <w:b w:val="false"/>
                 <w:i w:val="false"/>
-                <w:i w:val="false"/>
-                <w:caps w:val="false"/>
-                <w:smallCaps w:val="false"/>
-                <w:strike w:val="false"/>
-                <w:dstrike w:val="false"/>
-                <w:color w:val="000000"/>
-                <w:position w:val="0"/>
-                <w:sz w:val="24"/>
+                <w:caps w:val="false"/>
+                <w:smallCaps w:val="false"/>
+                <w:strike w:val="false"/>
+                <w:dstrike w:val="false"/>
+                <w:color w:val="000000"/>
+                <w:position w:val="0"/>
                 <w:sz w:val="24"/>
                 <w:szCs w:val="24"/>
                 <w:u w:val="none"/>
@@ -8488,7 +8536,6 @@
                 <w:dstrike w:val="false"/>
                 <w:color w:val="000000"/>
                 <w:position w:val="0"/>
-                <w:sz w:val="24"/>
                 <w:sz w:val="24"/>
                 <w:szCs w:val="24"/>
                 <w:u w:val="none"/>
@@ -8511,14 +8558,12 @@
                 <w:rFonts w:ascii="Arial" w:hAnsi="Arial" w:eastAsia="Calibri" w:cs="Calibri"/>
                 <w:b/>
                 <w:i w:val="false"/>
-                <w:i w:val="false"/>
-                <w:caps w:val="false"/>
-                <w:smallCaps w:val="false"/>
-                <w:strike w:val="false"/>
-                <w:dstrike w:val="false"/>
-                <w:color w:val="000000"/>
-                <w:position w:val="0"/>
-                <w:sz w:val="24"/>
+                <w:caps w:val="false"/>
+                <w:smallCaps w:val="false"/>
+                <w:strike w:val="false"/>
+                <w:dstrike w:val="false"/>
+                <w:color w:val="000000"/>
+                <w:position w:val="0"/>
                 <w:sz w:val="24"/>
                 <w:szCs w:val="24"/>
                 <w:u w:val="none"/>
@@ -8537,7 +8582,6 @@
                 <w:dstrike w:val="false"/>
                 <w:color w:val="000000"/>
                 <w:position w:val="0"/>
-                <w:sz w:val="24"/>
                 <w:sz w:val="24"/>
                 <w:szCs w:val="24"/>
                 <w:u w:val="none"/>
@@ -8571,14 +8615,12 @@
                 <w:rFonts w:ascii="Arial" w:hAnsi="Arial" w:eastAsia="Times New Roman" w:cs="Times New Roman"/>
                 <w:b w:val="false"/>
                 <w:i w:val="false"/>
-                <w:i w:val="false"/>
-                <w:caps w:val="false"/>
-                <w:smallCaps w:val="false"/>
-                <w:strike w:val="false"/>
-                <w:dstrike w:val="false"/>
-                <w:color w:val="000000"/>
-                <w:position w:val="0"/>
-                <w:sz w:val="24"/>
+                <w:caps w:val="false"/>
+                <w:smallCaps w:val="false"/>
+                <w:strike w:val="false"/>
+                <w:dstrike w:val="false"/>
+                <w:color w:val="000000"/>
+                <w:position w:val="0"/>
                 <w:sz w:val="24"/>
                 <w:szCs w:val="24"/>
                 <w:u w:val="none"/>
@@ -8597,7 +8639,6 @@
                 <w:dstrike w:val="false"/>
                 <w:color w:val="000000"/>
                 <w:position w:val="0"/>
-                <w:sz w:val="24"/>
                 <w:sz w:val="24"/>
                 <w:szCs w:val="24"/>
                 <w:u w:val="none"/>
@@ -8635,7 +8676,6 @@
                 <w:color w:val="000000"/>
                 <w:position w:val="0"/>
                 <w:sz w:val="24"/>
-                <w:sz w:val="24"/>
                 <w:szCs w:val="24"/>
                 <w:u w:val="none"/>
                 <w:shd w:fill="auto" w:val="clear"/>
@@ -8679,14 +8719,12 @@
                 <w:rFonts w:ascii="Arial" w:hAnsi="Arial" w:eastAsia="Times New Roman" w:cs="Times New Roman"/>
                 <w:b w:val="false"/>
                 <w:i w:val="false"/>
-                <w:i w:val="false"/>
-                <w:caps w:val="false"/>
-                <w:smallCaps w:val="false"/>
-                <w:strike w:val="false"/>
-                <w:dstrike w:val="false"/>
-                <w:color w:val="000000"/>
-                <w:position w:val="0"/>
-                <w:sz w:val="24"/>
+                <w:caps w:val="false"/>
+                <w:smallCaps w:val="false"/>
+                <w:strike w:val="false"/>
+                <w:dstrike w:val="false"/>
+                <w:color w:val="000000"/>
+                <w:position w:val="0"/>
                 <w:sz w:val="24"/>
                 <w:szCs w:val="24"/>
                 <w:u w:val="none"/>
@@ -8705,7 +8743,6 @@
                 <w:dstrike w:val="false"/>
                 <w:color w:val="000000"/>
                 <w:position w:val="0"/>
-                <w:sz w:val="24"/>
                 <w:sz w:val="24"/>
                 <w:szCs w:val="24"/>
                 <w:u w:val="none"/>
@@ -8743,7 +8780,6 @@
                 <w:color w:val="000000"/>
                 <w:position w:val="0"/>
                 <w:sz w:val="24"/>
-                <w:sz w:val="24"/>
                 <w:szCs w:val="24"/>
                 <w:u w:val="none"/>
                 <w:shd w:fill="auto" w:val="clear"/>
@@ -8803,7 +8839,7 @@
         </w:tc>
         <w:tc>
           <w:tcPr>
-            <w:tcW w:w="2651" w:type="dxa"/>
+            <w:tcW w:w="2652" w:type="dxa"/>
             <w:tcBorders>
               <w:top w:val="single" w:sz="4" w:space="0" w:color="000000"/>
               <w:left w:val="single" w:sz="4" w:space="0" w:color="000000"/>
@@ -8825,14 +8861,12 @@
                 <w:rFonts w:ascii="Arial" w:hAnsi="Arial" w:eastAsia="Times New Roman" w:cs="Times New Roman"/>
                 <w:b w:val="false"/>
                 <w:i w:val="false"/>
-                <w:i w:val="false"/>
-                <w:caps w:val="false"/>
-                <w:smallCaps w:val="false"/>
-                <w:strike w:val="false"/>
-                <w:dstrike w:val="false"/>
-                <w:color w:val="000000"/>
-                <w:position w:val="0"/>
-                <w:sz w:val="24"/>
+                <w:caps w:val="false"/>
+                <w:smallCaps w:val="false"/>
+                <w:strike w:val="false"/>
+                <w:dstrike w:val="false"/>
+                <w:color w:val="000000"/>
+                <w:position w:val="0"/>
                 <w:sz w:val="24"/>
                 <w:szCs w:val="24"/>
                 <w:u w:val="none"/>
@@ -8851,7 +8885,6 @@
                 <w:dstrike w:val="false"/>
                 <w:color w:val="000000"/>
                 <w:position w:val="0"/>
-                <w:sz w:val="24"/>
                 <w:sz w:val="24"/>
                 <w:szCs w:val="24"/>
                 <w:u w:val="none"/>
@@ -9000,7 +9033,6 @@
           <w:dstrike w:val="false"/>
           <w:color w:val="000000"/>
           <w:position w:val="0"/>
-          <w:sz w:val="24"/>
           <w:sz w:val="24"/>
           <w:szCs w:val="24"/>
           <w:u w:val="none"/>

</xml_diff>

<commit_message>
:bug: :sparkles: fixing bugs and add function to reorder input
</commit_message>
<xml_diff>
--- a/src/assets/planejamentoSemanal7.docx
+++ b/src/assets/planejamentoSemanal7.docx
@@ -65,9 +65,9 @@
         <w:tblLook w:val="0000"/>
       </w:tblPr>
       <w:tblGrid>
-        <w:gridCol w:w="1259"/>
+        <w:gridCol w:w="1258"/>
         <w:gridCol w:w="3360"/>
-        <w:gridCol w:w="2881"/>
+        <w:gridCol w:w="2882"/>
         <w:gridCol w:w="2624"/>
         <w:gridCol w:w="2775"/>
         <w:gridCol w:w="2656"/>
@@ -206,7 +206,7 @@
         </w:trPr>
         <w:tc>
           <w:tcPr>
-            <w:tcW w:w="1259" w:type="dxa"/>
+            <w:tcW w:w="1258" w:type="dxa"/>
             <w:tcBorders>
               <w:top w:val="single" w:sz="4" w:space="0" w:color="000000"/>
               <w:left w:val="single" w:sz="4" w:space="0" w:color="000000"/>
@@ -302,7 +302,7 @@
         </w:tc>
         <w:tc>
           <w:tcPr>
-            <w:tcW w:w="2881" w:type="dxa"/>
+            <w:tcW w:w="2882" w:type="dxa"/>
             <w:tcBorders>
               <w:top w:val="single" w:sz="4" w:space="0" w:color="000000"/>
               <w:left w:val="single" w:sz="4" w:space="0" w:color="000000"/>
@@ -499,7 +499,7 @@
         </w:trPr>
         <w:tc>
           <w:tcPr>
-            <w:tcW w:w="1259" w:type="dxa"/>
+            <w:tcW w:w="1258" w:type="dxa"/>
             <w:tcBorders>
               <w:top w:val="single" w:sz="4" w:space="0" w:color="000000"/>
               <w:left w:val="single" w:sz="4" w:space="0" w:color="000000"/>
@@ -675,7 +675,7 @@
         </w:tc>
         <w:tc>
           <w:tcPr>
-            <w:tcW w:w="2881" w:type="dxa"/>
+            <w:tcW w:w="2882" w:type="dxa"/>
             <w:tcBorders>
               <w:top w:val="single" w:sz="4" w:space="0" w:color="000000"/>
               <w:left w:val="single" w:sz="4" w:space="0" w:color="000000"/>
@@ -844,7 +844,7 @@
         </w:trPr>
         <w:tc>
           <w:tcPr>
-            <w:tcW w:w="1259" w:type="dxa"/>
+            <w:tcW w:w="1258" w:type="dxa"/>
             <w:tcBorders>
               <w:top w:val="single" w:sz="4" w:space="0" w:color="000000"/>
               <w:left w:val="single" w:sz="4" w:space="0" w:color="000000"/>
@@ -992,7 +992,7 @@
         </w:tc>
         <w:tc>
           <w:tcPr>
-            <w:tcW w:w="2881" w:type="dxa"/>
+            <w:tcW w:w="2882" w:type="dxa"/>
             <w:tcBorders>
               <w:top w:val="single" w:sz="4" w:space="0" w:color="000000"/>
               <w:left w:val="single" w:sz="4" w:space="0" w:color="000000"/>
@@ -1399,7 +1399,7 @@
         </w:trPr>
         <w:tc>
           <w:tcPr>
-            <w:tcW w:w="1259" w:type="dxa"/>
+            <w:tcW w:w="1258" w:type="dxa"/>
             <w:tcBorders>
               <w:top w:val="single" w:sz="4" w:space="0" w:color="000000"/>
               <w:left w:val="single" w:sz="4" w:space="0" w:color="000000"/>
@@ -1593,7 +1593,7 @@
         </w:tc>
         <w:tc>
           <w:tcPr>
-            <w:tcW w:w="2881" w:type="dxa"/>
+            <w:tcW w:w="2882" w:type="dxa"/>
             <w:tcBorders>
               <w:top w:val="single" w:sz="4" w:space="0" w:color="000000"/>
               <w:left w:val="single" w:sz="4" w:space="0" w:color="000000"/>
@@ -2043,9 +2043,9 @@
     <w:tbl>
       <w:tblPr>
         <w:tblStyle w:val="Table2"/>
-        <w:tblW w:w="15549" w:type="dxa"/>
+        <w:tblW w:w="15516" w:type="dxa"/>
         <w:jc w:val="left"/>
-        <w:tblInd w:w="110" w:type="dxa"/>
+        <w:tblInd w:w="143" w:type="dxa"/>
         <w:tblLayout w:type="fixed"/>
         <w:tblCellMar>
           <w:top w:w="0" w:type="dxa"/>
@@ -2056,12 +2056,12 @@
         <w:tblLook w:val="0000"/>
       </w:tblPr>
       <w:tblGrid>
-        <w:gridCol w:w="1905"/>
-        <w:gridCol w:w="2708"/>
-        <w:gridCol w:w="2881"/>
-        <w:gridCol w:w="2615"/>
-        <w:gridCol w:w="2788"/>
-        <w:gridCol w:w="2652"/>
+        <w:gridCol w:w="1875"/>
+        <w:gridCol w:w="2715"/>
+        <w:gridCol w:w="2880"/>
+        <w:gridCol w:w="2610"/>
+        <w:gridCol w:w="2790"/>
+        <w:gridCol w:w="2646"/>
       </w:tblGrid>
       <w:tr>
         <w:trPr>
@@ -2069,7 +2069,7 @@
         </w:trPr>
         <w:tc>
           <w:tcPr>
-            <w:tcW w:w="1905" w:type="dxa"/>
+            <w:tcW w:w="1875" w:type="dxa"/>
             <w:tcBorders>
               <w:left w:val="single" w:sz="4" w:space="0" w:color="000000"/>
               <w:bottom w:val="single" w:sz="4" w:space="0" w:color="000000"/>
@@ -2125,7 +2125,7 @@
         </w:tc>
         <w:tc>
           <w:tcPr>
-            <w:tcW w:w="2708" w:type="dxa"/>
+            <w:tcW w:w="2715" w:type="dxa"/>
             <w:tcBorders>
               <w:left w:val="single" w:sz="4" w:space="0" w:color="000000"/>
               <w:bottom w:val="single" w:sz="4" w:space="0" w:color="000000"/>
@@ -2192,7 +2192,7 @@
         </w:tc>
         <w:tc>
           <w:tcPr>
-            <w:tcW w:w="2881" w:type="dxa"/>
+            <w:tcW w:w="2880" w:type="dxa"/>
             <w:tcBorders>
               <w:left w:val="single" w:sz="4" w:space="0" w:color="000000"/>
               <w:bottom w:val="single" w:sz="4" w:space="0" w:color="000000"/>
@@ -2282,7 +2282,7 @@
         </w:tc>
         <w:tc>
           <w:tcPr>
-            <w:tcW w:w="2615" w:type="dxa"/>
+            <w:tcW w:w="2610" w:type="dxa"/>
             <w:tcBorders>
               <w:left w:val="single" w:sz="4" w:space="0" w:color="000000"/>
               <w:bottom w:val="single" w:sz="4" w:space="0" w:color="000000"/>
@@ -2403,7 +2403,7 @@
         </w:tc>
         <w:tc>
           <w:tcPr>
-            <w:tcW w:w="2788" w:type="dxa"/>
+            <w:tcW w:w="2790" w:type="dxa"/>
             <w:tcBorders>
               <w:left w:val="single" w:sz="4" w:space="0" w:color="000000"/>
               <w:bottom w:val="single" w:sz="4" w:space="0" w:color="000000"/>
@@ -2525,7 +2525,7 @@
         </w:tc>
         <w:tc>
           <w:tcPr>
-            <w:tcW w:w="2652" w:type="dxa"/>
+            <w:tcW w:w="2646" w:type="dxa"/>
             <w:tcBorders>
               <w:left w:val="single" w:sz="4" w:space="0" w:color="000000"/>
               <w:bottom w:val="single" w:sz="4" w:space="0" w:color="000000"/>
@@ -2620,7 +2620,7 @@
         </w:trPr>
         <w:tc>
           <w:tcPr>
-            <w:tcW w:w="1905" w:type="dxa"/>
+            <w:tcW w:w="1875" w:type="dxa"/>
             <w:tcBorders>
               <w:top w:val="single" w:sz="4" w:space="0" w:color="000000"/>
               <w:left w:val="single" w:sz="4" w:space="0" w:color="000000"/>
@@ -2653,43 +2653,13 @@
                 <w:sz w:val="24"/>
                 <w:szCs w:val="24"/>
               </w:rPr>
-              <w:t>1</w:t>
-            </w:r>
-            <w:r>
-              <w:rPr>
-                <w:rFonts w:ascii="Arial" w:hAnsi="Arial"/>
-                <w:b/>
-                <w:color w:val="000000"/>
-                <w:sz w:val="24"/>
-                <w:szCs w:val="24"/>
-              </w:rPr>
-              <w:t>3:45</w:t>
-            </w:r>
-            <w:r>
-              <w:rPr>
-                <w:rFonts w:ascii="Arial" w:hAnsi="Arial"/>
-                <w:b/>
-                <w:color w:val="000000"/>
-                <w:sz w:val="24"/>
-                <w:szCs w:val="24"/>
-              </w:rPr>
-              <w:t>H às 14:</w:t>
-            </w:r>
-            <w:r>
-              <w:rPr>
-                <w:rFonts w:ascii="Arial" w:hAnsi="Arial"/>
-                <w:b/>
-                <w:color w:val="000000"/>
-                <w:sz w:val="24"/>
-                <w:szCs w:val="24"/>
-              </w:rPr>
-              <w:t>00</w:t>
-            </w:r>
-          </w:p>
-        </w:tc>
-        <w:tc>
-          <w:tcPr>
-            <w:tcW w:w="2708" w:type="dxa"/>
+              <w:t>13:45H às 14:00</w:t>
+            </w:r>
+          </w:p>
+        </w:tc>
+        <w:tc>
+          <w:tcPr>
+            <w:tcW w:w="2715" w:type="dxa"/>
             <w:tcBorders>
               <w:top w:val="single" w:sz="4" w:space="0" w:color="000000"/>
               <w:left w:val="single" w:sz="4" w:space="0" w:color="000000"/>
@@ -2737,7 +2707,7 @@
         </w:tc>
         <w:tc>
           <w:tcPr>
-            <w:tcW w:w="2881" w:type="dxa"/>
+            <w:tcW w:w="2880" w:type="dxa"/>
             <w:tcBorders>
               <w:top w:val="single" w:sz="4" w:space="0" w:color="000000"/>
               <w:left w:val="single" w:sz="4" w:space="0" w:color="000000"/>
@@ -2785,7 +2755,7 @@
         </w:tc>
         <w:tc>
           <w:tcPr>
-            <w:tcW w:w="2615" w:type="dxa"/>
+            <w:tcW w:w="2610" w:type="dxa"/>
             <w:tcBorders>
               <w:top w:val="single" w:sz="4" w:space="0" w:color="000000"/>
               <w:left w:val="single" w:sz="4" w:space="0" w:color="000000"/>
@@ -2833,7 +2803,7 @@
         </w:tc>
         <w:tc>
           <w:tcPr>
-            <w:tcW w:w="2788" w:type="dxa"/>
+            <w:tcW w:w="2790" w:type="dxa"/>
             <w:tcBorders>
               <w:top w:val="single" w:sz="4" w:space="0" w:color="000000"/>
               <w:left w:val="single" w:sz="4" w:space="0" w:color="000000"/>
@@ -2881,7 +2851,7 @@
         </w:tc>
         <w:tc>
           <w:tcPr>
-            <w:tcW w:w="2652" w:type="dxa"/>
+            <w:tcW w:w="2646" w:type="dxa"/>
             <w:tcBorders>
               <w:top w:val="single" w:sz="4" w:space="0" w:color="000000"/>
               <w:left w:val="single" w:sz="4" w:space="0" w:color="000000"/>
@@ -2932,7 +2902,7 @@
         <w:trPr/>
         <w:tc>
           <w:tcPr>
-            <w:tcW w:w="1905" w:type="dxa"/>
+            <w:tcW w:w="1875" w:type="dxa"/>
             <w:tcBorders>
               <w:top w:val="single" w:sz="4" w:space="0" w:color="000000"/>
               <w:left w:val="single" w:sz="4" w:space="0" w:color="000000"/>
@@ -2956,7 +2926,6 @@
             <w:r>
               <w:rPr>
                 <w:rFonts w:ascii="Arial" w:hAnsi="Arial"/>
-                <w:b/>
                 <w:color w:val="000000"/>
                 <w:sz w:val="24"/>
                 <w:szCs w:val="24"/>
@@ -2991,7 +2960,7 @@
         </w:tc>
         <w:tc>
           <w:tcPr>
-            <w:tcW w:w="2708" w:type="dxa"/>
+            <w:tcW w:w="2715" w:type="dxa"/>
             <w:tcBorders>
               <w:top w:val="single" w:sz="4" w:space="0" w:color="000000"/>
               <w:left w:val="single" w:sz="4" w:space="0" w:color="000000"/>
@@ -3039,7 +3008,7 @@
         </w:tc>
         <w:tc>
           <w:tcPr>
-            <w:tcW w:w="2881" w:type="dxa"/>
+            <w:tcW w:w="2880" w:type="dxa"/>
             <w:tcBorders>
               <w:top w:val="single" w:sz="4" w:space="0" w:color="000000"/>
               <w:left w:val="single" w:sz="4" w:space="0" w:color="000000"/>
@@ -3133,7 +3102,7 @@
         </w:tc>
         <w:tc>
           <w:tcPr>
-            <w:tcW w:w="2615" w:type="dxa"/>
+            <w:tcW w:w="2610" w:type="dxa"/>
             <w:tcBorders>
               <w:top w:val="single" w:sz="4" w:space="0" w:color="000000"/>
               <w:left w:val="single" w:sz="4" w:space="0" w:color="000000"/>
@@ -3227,7 +3196,7 @@
         </w:tc>
         <w:tc>
           <w:tcPr>
-            <w:tcW w:w="2788" w:type="dxa"/>
+            <w:tcW w:w="2790" w:type="dxa"/>
             <w:tcBorders>
               <w:top w:val="single" w:sz="4" w:space="0" w:color="000000"/>
               <w:left w:val="single" w:sz="4" w:space="0" w:color="000000"/>
@@ -3395,7 +3364,7 @@
         </w:tc>
         <w:tc>
           <w:tcPr>
-            <w:tcW w:w="2652" w:type="dxa"/>
+            <w:tcW w:w="2646" w:type="dxa"/>
             <w:tcBorders>
               <w:top w:val="single" w:sz="4" w:space="0" w:color="000000"/>
               <w:left w:val="single" w:sz="4" w:space="0" w:color="000000"/>
@@ -3494,7 +3463,7 @@
         </w:trPr>
         <w:tc>
           <w:tcPr>
-            <w:tcW w:w="1905" w:type="dxa"/>
+            <w:tcW w:w="1875" w:type="dxa"/>
             <w:tcBorders>
               <w:top w:val="single" w:sz="4" w:space="0" w:color="000000"/>
               <w:left w:val="single" w:sz="4" w:space="0" w:color="000000"/>
@@ -3529,7 +3498,7 @@
         </w:tc>
         <w:tc>
           <w:tcPr>
-            <w:tcW w:w="2708" w:type="dxa"/>
+            <w:tcW w:w="2715" w:type="dxa"/>
             <w:tcBorders>
               <w:top w:val="single" w:sz="4" w:space="0" w:color="000000"/>
               <w:left w:val="single" w:sz="4" w:space="0" w:color="000000"/>
@@ -3632,7 +3601,7 @@
         </w:tc>
         <w:tc>
           <w:tcPr>
-            <w:tcW w:w="2881" w:type="dxa"/>
+            <w:tcW w:w="2880" w:type="dxa"/>
             <w:tcBorders>
               <w:top w:val="single" w:sz="4" w:space="0" w:color="000000"/>
               <w:left w:val="single" w:sz="4" w:space="0" w:color="000000"/>
@@ -3689,7 +3658,7 @@
         </w:tc>
         <w:tc>
           <w:tcPr>
-            <w:tcW w:w="2615" w:type="dxa"/>
+            <w:tcW w:w="2610" w:type="dxa"/>
             <w:tcBorders>
               <w:top w:val="single" w:sz="4" w:space="0" w:color="000000"/>
               <w:left w:val="single" w:sz="4" w:space="0" w:color="000000"/>
@@ -3774,7 +3743,7 @@
         </w:tc>
         <w:tc>
           <w:tcPr>
-            <w:tcW w:w="2788" w:type="dxa"/>
+            <w:tcW w:w="2790" w:type="dxa"/>
             <w:tcBorders>
               <w:top w:val="single" w:sz="4" w:space="0" w:color="000000"/>
               <w:left w:val="single" w:sz="4" w:space="0" w:color="000000"/>
@@ -3859,7 +3828,7 @@
         </w:tc>
         <w:tc>
           <w:tcPr>
-            <w:tcW w:w="2652" w:type="dxa"/>
+            <w:tcW w:w="2646" w:type="dxa"/>
             <w:tcBorders>
               <w:top w:val="single" w:sz="4" w:space="0" w:color="000000"/>
               <w:left w:val="single" w:sz="4" w:space="0" w:color="000000"/>
@@ -3949,7 +3918,7 @@
         </w:trPr>
         <w:tc>
           <w:tcPr>
-            <w:tcW w:w="1905" w:type="dxa"/>
+            <w:tcW w:w="1875" w:type="dxa"/>
             <w:tcBorders>
               <w:top w:val="single" w:sz="4" w:space="0" w:color="000000"/>
               <w:left w:val="single" w:sz="4" w:space="0" w:color="000000"/>
@@ -3978,17 +3947,7 @@
                 <w:sz w:val="24"/>
                 <w:szCs w:val="24"/>
               </w:rPr>
-              <w:t>14H</w:t>
-            </w:r>
-            <w:r>
-              <w:rPr>
-                <w:rFonts w:ascii="Arial" w:hAnsi="Arial"/>
-                <w:b/>
-                <w:color w:val="000000"/>
-                <w:sz w:val="24"/>
-                <w:szCs w:val="24"/>
-              </w:rPr>
-              <w:t xml:space="preserve"> ~ 17H</w:t>
+              <w:t>14H ~ 17H</w:t>
               <w:br/>
               <w:t>Com intervalo de 30 ~ 45 min em cada atividade</w:t>
             </w:r>
@@ -3996,7 +3955,7 @@
         </w:tc>
         <w:tc>
           <w:tcPr>
-            <w:tcW w:w="2708" w:type="dxa"/>
+            <w:tcW w:w="2715" w:type="dxa"/>
             <w:tcBorders>
               <w:top w:val="single" w:sz="4" w:space="0" w:color="000000"/>
               <w:left w:val="single" w:sz="4" w:space="0" w:color="000000"/>
@@ -4054,7 +4013,7 @@
         </w:tc>
         <w:tc>
           <w:tcPr>
-            <w:tcW w:w="2881" w:type="dxa"/>
+            <w:tcW w:w="2880" w:type="dxa"/>
             <w:tcBorders>
               <w:top w:val="single" w:sz="4" w:space="0" w:color="000000"/>
               <w:left w:val="single" w:sz="4" w:space="0" w:color="000000"/>
@@ -4120,7 +4079,7 @@
         </w:tc>
         <w:tc>
           <w:tcPr>
-            <w:tcW w:w="2615" w:type="dxa"/>
+            <w:tcW w:w="2610" w:type="dxa"/>
             <w:tcBorders>
               <w:top w:val="single" w:sz="4" w:space="0" w:color="000000"/>
               <w:left w:val="single" w:sz="4" w:space="0" w:color="000000"/>
@@ -4235,7 +4194,7 @@
         </w:tc>
         <w:tc>
           <w:tcPr>
-            <w:tcW w:w="2788" w:type="dxa"/>
+            <w:tcW w:w="2790" w:type="dxa"/>
             <w:tcBorders>
               <w:top w:val="single" w:sz="4" w:space="0" w:color="000000"/>
               <w:left w:val="single" w:sz="4" w:space="0" w:color="000000"/>
@@ -4381,7 +4340,7 @@
         </w:tc>
         <w:tc>
           <w:tcPr>
-            <w:tcW w:w="2652" w:type="dxa"/>
+            <w:tcW w:w="2646" w:type="dxa"/>
             <w:tcBorders>
               <w:top w:val="single" w:sz="4" w:space="0" w:color="000000"/>
               <w:left w:val="single" w:sz="4" w:space="0" w:color="000000"/>
@@ -4512,11 +4471,11 @@
         <w:tblLook w:val="0000"/>
       </w:tblPr>
       <w:tblGrid>
-        <w:gridCol w:w="2055"/>
+        <w:gridCol w:w="2054"/>
         <w:gridCol w:w="2445"/>
         <w:gridCol w:w="2880"/>
         <w:gridCol w:w="2610"/>
-        <w:gridCol w:w="2790"/>
+        <w:gridCol w:w="2791"/>
         <w:gridCol w:w="2646"/>
       </w:tblGrid>
       <w:tr>
@@ -4525,7 +4484,7 @@
         </w:trPr>
         <w:tc>
           <w:tcPr>
-            <w:tcW w:w="2055" w:type="dxa"/>
+            <w:tcW w:w="2054" w:type="dxa"/>
             <w:tcBorders>
               <w:left w:val="single" w:sz="4" w:space="0" w:color="000000"/>
               <w:bottom w:val="single" w:sz="4" w:space="0" w:color="000000"/>
@@ -4553,17 +4512,7 @@
                 <w:sz w:val="24"/>
                 <w:szCs w:val="24"/>
               </w:rPr>
-              <w:t>1</w:t>
-            </w:r>
-            <w:r>
-              <w:rPr>
-                <w:rFonts w:ascii="Arial" w:hAnsi="Arial"/>
-                <w:b/>
-                <w:color w:val="000000"/>
-                <w:sz w:val="24"/>
-                <w:szCs w:val="24"/>
-              </w:rPr>
-              <w:t>6:45 ~ 17H</w:t>
+              <w:t>16:45 ~ 17H</w:t>
             </w:r>
           </w:p>
         </w:tc>
@@ -4713,7 +4662,7 @@
         </w:tc>
         <w:tc>
           <w:tcPr>
-            <w:tcW w:w="2790" w:type="dxa"/>
+            <w:tcW w:w="2791" w:type="dxa"/>
             <w:tcBorders>
               <w:left w:val="single" w:sz="4" w:space="0" w:color="000000"/>
               <w:bottom w:val="single" w:sz="4" w:space="0" w:color="000000"/>
@@ -4786,7 +4735,7 @@
         </w:trPr>
         <w:tc>
           <w:tcPr>
-            <w:tcW w:w="2055" w:type="dxa"/>
+            <w:tcW w:w="2054" w:type="dxa"/>
             <w:tcBorders>
               <w:top w:val="single" w:sz="4" w:space="0" w:color="000000"/>
               <w:left w:val="single" w:sz="4" w:space="0" w:color="000000"/>
@@ -4935,8 +4884,30 @@
                 <w:sz w:val="24"/>
                 <w:szCs w:val="24"/>
               </w:rPr>
-              <w:t xml:space="preserve">Parque </w:t>
-            </w:r>
+              <w:t>Parque (14:30)</w:t>
+            </w:r>
+          </w:p>
+        </w:tc>
+        <w:tc>
+          <w:tcPr>
+            <w:tcW w:w="2610" w:type="dxa"/>
+            <w:tcBorders>
+              <w:top w:val="single" w:sz="4" w:space="0" w:color="000000"/>
+              <w:left w:val="single" w:sz="4" w:space="0" w:color="000000"/>
+              <w:bottom w:val="single" w:sz="4" w:space="0" w:color="000000"/>
+              <w:right w:val="single" w:sz="4" w:space="0" w:color="000000"/>
+            </w:tcBorders>
+          </w:tcPr>
+          <w:p>
+            <w:pPr>
+              <w:pStyle w:val="normal1"/>
+              <w:rPr>
+                <w:rFonts w:ascii="Arial" w:hAnsi="Arial"/>
+                <w:color w:val="000000"/>
+                <w:sz w:val="24"/>
+                <w:szCs w:val="24"/>
+              </w:rPr>
+            </w:pPr>
             <w:r>
               <w:rPr>
                 <w:rFonts w:eastAsia="Arial" w:cs="Arial" w:ascii="Arial" w:hAnsi="Arial"/>
@@ -4945,13 +4916,55 @@
                 <w:sz w:val="24"/>
                 <w:szCs w:val="24"/>
               </w:rPr>
-              <w:t>(14:30)</w:t>
-            </w:r>
-          </w:p>
-        </w:tc>
-        <w:tc>
-          <w:tcPr>
-            <w:tcW w:w="2610" w:type="dxa"/>
+              <w:t>Quadra (Horario a definir)</w:t>
+            </w:r>
+          </w:p>
+          <w:p>
+            <w:pPr>
+              <w:pStyle w:val="normal1"/>
+              <w:rPr>
+                <w:rFonts w:ascii="Arial" w:hAnsi="Arial" w:eastAsia="Arial" w:cs="Arial"/>
+                <w:b/>
+                <w:color w:val="000000"/>
+                <w:sz w:val="24"/>
+                <w:szCs w:val="24"/>
+              </w:rPr>
+            </w:pPr>
+            <w:r>
+              <w:rPr>
+                <w:rFonts w:eastAsia="Arial" w:cs="Arial" w:ascii="Arial" w:hAnsi="Arial"/>
+                <w:b/>
+                <w:color w:val="000000"/>
+                <w:sz w:val="24"/>
+                <w:szCs w:val="24"/>
+              </w:rPr>
+            </w:r>
+          </w:p>
+          <w:p>
+            <w:pPr>
+              <w:pStyle w:val="normal1"/>
+              <w:rPr>
+                <w:rFonts w:ascii="Arial" w:hAnsi="Arial" w:eastAsia="Arial" w:cs="Arial"/>
+                <w:b/>
+                <w:color w:val="000000"/>
+                <w:sz w:val="24"/>
+                <w:szCs w:val="24"/>
+              </w:rPr>
+            </w:pPr>
+            <w:r>
+              <w:rPr>
+                <w:rFonts w:eastAsia="Arial" w:cs="Arial" w:ascii="Arial" w:hAnsi="Arial"/>
+                <w:b/>
+                <w:color w:val="000000"/>
+                <w:sz w:val="24"/>
+                <w:szCs w:val="24"/>
+              </w:rPr>
+            </w:r>
+          </w:p>
+        </w:tc>
+        <w:tc>
+          <w:tcPr>
+            <w:tcW w:w="2791" w:type="dxa"/>
             <w:tcBorders>
               <w:top w:val="single" w:sz="4" w:space="0" w:color="000000"/>
               <w:left w:val="single" w:sz="4" w:space="0" w:color="000000"/>
@@ -4977,8 +4990,20 @@
                 <w:sz w:val="24"/>
                 <w:szCs w:val="24"/>
               </w:rPr>
-              <w:t xml:space="preserve">Quadra </w:t>
-            </w:r>
+              <w:t>Solário (14:30)</w:t>
+            </w:r>
+          </w:p>
+          <w:p>
+            <w:pPr>
+              <w:pStyle w:val="normal1"/>
+              <w:rPr>
+                <w:rFonts w:ascii="Arial" w:hAnsi="Arial" w:eastAsia="Arial" w:cs="Arial"/>
+                <w:b/>
+                <w:color w:val="000000"/>
+                <w:sz w:val="24"/>
+                <w:szCs w:val="24"/>
+              </w:rPr>
+            </w:pPr>
             <w:r>
               <w:rPr>
                 <w:rFonts w:eastAsia="Arial" w:cs="Arial" w:ascii="Arial" w:hAnsi="Arial"/>
@@ -4987,7 +5012,6 @@
                 <w:sz w:val="24"/>
                 <w:szCs w:val="24"/>
               </w:rPr>
-              <w:t>(Horario a definir)</w:t>
             </w:r>
           </w:p>
           <w:p>
@@ -5011,6 +5035,17 @@
               </w:rPr>
             </w:r>
           </w:p>
+        </w:tc>
+        <w:tc>
+          <w:tcPr>
+            <w:tcW w:w="2646" w:type="dxa"/>
+            <w:tcBorders>
+              <w:top w:val="single" w:sz="4" w:space="0" w:color="000000"/>
+              <w:left w:val="single" w:sz="4" w:space="0" w:color="000000"/>
+              <w:bottom w:val="single" w:sz="4" w:space="0" w:color="000000"/>
+              <w:right w:val="single" w:sz="4" w:space="0" w:color="000000"/>
+            </w:tcBorders>
+          </w:tcPr>
           <w:p>
             <w:pPr>
               <w:pStyle w:val="normal1"/>
@@ -5032,17 +5067,6 @@
               </w:rPr>
             </w:r>
           </w:p>
-        </w:tc>
-        <w:tc>
-          <w:tcPr>
-            <w:tcW w:w="2790" w:type="dxa"/>
-            <w:tcBorders>
-              <w:top w:val="single" w:sz="4" w:space="0" w:color="000000"/>
-              <w:left w:val="single" w:sz="4" w:space="0" w:color="000000"/>
-              <w:bottom w:val="single" w:sz="4" w:space="0" w:color="000000"/>
-              <w:right w:val="single" w:sz="4" w:space="0" w:color="000000"/>
-            </w:tcBorders>
-          </w:tcPr>
           <w:p>
             <w:pPr>
               <w:pStyle w:val="normal1"/>
@@ -5061,122 +5085,7 @@
                 <w:sz w:val="24"/>
                 <w:szCs w:val="24"/>
               </w:rPr>
-              <w:t xml:space="preserve">Solário </w:t>
-            </w:r>
-            <w:r>
-              <w:rPr>
-                <w:rFonts w:eastAsia="Arial" w:cs="Arial" w:ascii="Arial" w:hAnsi="Arial"/>
-                <w:b/>
-                <w:color w:val="000000"/>
-                <w:sz w:val="24"/>
-                <w:szCs w:val="24"/>
-              </w:rPr>
-              <w:t>(14:30)</w:t>
-            </w:r>
-          </w:p>
-          <w:p>
-            <w:pPr>
-              <w:pStyle w:val="normal1"/>
-              <w:rPr>
-                <w:rFonts w:ascii="Arial" w:hAnsi="Arial" w:eastAsia="Arial" w:cs="Arial"/>
-                <w:b/>
-                <w:color w:val="000000"/>
-                <w:sz w:val="24"/>
-                <w:szCs w:val="24"/>
-              </w:rPr>
-            </w:pPr>
-            <w:r>
-              <w:rPr>
-                <w:rFonts w:eastAsia="Arial" w:cs="Arial" w:ascii="Arial" w:hAnsi="Arial"/>
-                <w:b/>
-                <w:color w:val="000000"/>
-                <w:sz w:val="24"/>
-                <w:szCs w:val="24"/>
-              </w:rPr>
-            </w:r>
-          </w:p>
-          <w:p>
-            <w:pPr>
-              <w:pStyle w:val="normal1"/>
-              <w:rPr>
-                <w:rFonts w:ascii="Arial" w:hAnsi="Arial" w:eastAsia="Arial" w:cs="Arial"/>
-                <w:b/>
-                <w:color w:val="000000"/>
-                <w:sz w:val="24"/>
-                <w:szCs w:val="24"/>
-              </w:rPr>
-            </w:pPr>
-            <w:r>
-              <w:rPr>
-                <w:rFonts w:eastAsia="Arial" w:cs="Arial" w:ascii="Arial" w:hAnsi="Arial"/>
-                <w:b/>
-                <w:color w:val="000000"/>
-                <w:sz w:val="24"/>
-                <w:szCs w:val="24"/>
-              </w:rPr>
-            </w:r>
-          </w:p>
-        </w:tc>
-        <w:tc>
-          <w:tcPr>
-            <w:tcW w:w="2646" w:type="dxa"/>
-            <w:tcBorders>
-              <w:top w:val="single" w:sz="4" w:space="0" w:color="000000"/>
-              <w:left w:val="single" w:sz="4" w:space="0" w:color="000000"/>
-              <w:bottom w:val="single" w:sz="4" w:space="0" w:color="000000"/>
-              <w:right w:val="single" w:sz="4" w:space="0" w:color="000000"/>
-            </w:tcBorders>
-          </w:tcPr>
-          <w:p>
-            <w:pPr>
-              <w:pStyle w:val="normal1"/>
-              <w:rPr>
-                <w:rFonts w:ascii="Arial" w:hAnsi="Arial" w:eastAsia="Arial" w:cs="Arial"/>
-                <w:b/>
-                <w:color w:val="000000"/>
-                <w:sz w:val="24"/>
-                <w:szCs w:val="24"/>
-              </w:rPr>
-            </w:pPr>
-            <w:r>
-              <w:rPr>
-                <w:rFonts w:eastAsia="Arial" w:cs="Arial" w:ascii="Arial" w:hAnsi="Arial"/>
-                <w:b/>
-                <w:color w:val="000000"/>
-                <w:sz w:val="24"/>
-                <w:szCs w:val="24"/>
-              </w:rPr>
-            </w:r>
-          </w:p>
-          <w:p>
-            <w:pPr>
-              <w:pStyle w:val="normal1"/>
-              <w:rPr>
-                <w:rFonts w:ascii="Arial" w:hAnsi="Arial"/>
-                <w:color w:val="000000"/>
-                <w:sz w:val="24"/>
-                <w:szCs w:val="24"/>
-              </w:rPr>
-            </w:pPr>
-            <w:r>
-              <w:rPr>
-                <w:rFonts w:eastAsia="Arial" w:cs="Arial" w:ascii="Arial" w:hAnsi="Arial"/>
-                <w:b/>
-                <w:color w:val="000000"/>
-                <w:sz w:val="24"/>
-                <w:szCs w:val="24"/>
-              </w:rPr>
-              <w:t xml:space="preserve">Parque </w:t>
-            </w:r>
-            <w:r>
-              <w:rPr>
-                <w:rFonts w:eastAsia="Arial" w:cs="Arial" w:ascii="Arial" w:hAnsi="Arial"/>
-                <w:b/>
-                <w:color w:val="000000"/>
-                <w:sz w:val="24"/>
-                <w:szCs w:val="24"/>
-              </w:rPr>
-              <w:t>(14:30)</w:t>
+              <w:t>Parque (14:30)</w:t>
             </w:r>
           </w:p>
         </w:tc>
@@ -5187,7 +5096,7 @@
         </w:trPr>
         <w:tc>
           <w:tcPr>
-            <w:tcW w:w="2055" w:type="dxa"/>
+            <w:tcW w:w="2054" w:type="dxa"/>
             <w:tcBorders>
               <w:top w:val="single" w:sz="4" w:space="0" w:color="000000"/>
               <w:left w:val="single" w:sz="4" w:space="0" w:color="000000"/>
@@ -5353,7 +5262,7 @@
         </w:tc>
         <w:tc>
           <w:tcPr>
-            <w:tcW w:w="2790" w:type="dxa"/>
+            <w:tcW w:w="2791" w:type="dxa"/>
             <w:tcBorders>
               <w:top w:val="single" w:sz="4" w:space="0" w:color="000000"/>
               <w:left w:val="single" w:sz="4" w:space="0" w:color="000000"/>
@@ -5426,7 +5335,7 @@
         </w:trPr>
         <w:tc>
           <w:tcPr>
-            <w:tcW w:w="2055" w:type="dxa"/>
+            <w:tcW w:w="2054" w:type="dxa"/>
             <w:tcBorders>
               <w:left w:val="single" w:sz="4" w:space="0" w:color="000000"/>
               <w:bottom w:val="single" w:sz="4" w:space="0" w:color="000000"/>
@@ -5586,7 +5495,7 @@
         </w:tc>
         <w:tc>
           <w:tcPr>
-            <w:tcW w:w="2790" w:type="dxa"/>
+            <w:tcW w:w="2791" w:type="dxa"/>
             <w:tcBorders>
               <w:left w:val="single" w:sz="4" w:space="0" w:color="000000"/>
               <w:bottom w:val="single" w:sz="4" w:space="0" w:color="000000"/>
@@ -5673,7 +5582,7 @@
         </w:trPr>
         <w:tc>
           <w:tcPr>
-            <w:tcW w:w="2055" w:type="dxa"/>
+            <w:tcW w:w="2054" w:type="dxa"/>
             <w:tcBorders>
               <w:top w:val="single" w:sz="4" w:space="0" w:color="000000"/>
               <w:left w:val="single" w:sz="4" w:space="0" w:color="000000"/>
@@ -5919,7 +5828,7 @@
         </w:tc>
         <w:tc>
           <w:tcPr>
-            <w:tcW w:w="2790" w:type="dxa"/>
+            <w:tcW w:w="2791" w:type="dxa"/>
             <w:tcBorders>
               <w:top w:val="single" w:sz="4" w:space="0" w:color="000000"/>
               <w:left w:val="single" w:sz="4" w:space="0" w:color="000000"/>
@@ -6228,9 +6137,9 @@
         <w:gridCol w:w="1284"/>
         <w:gridCol w:w="3329"/>
         <w:gridCol w:w="2881"/>
-        <w:gridCol w:w="2615"/>
+        <w:gridCol w:w="2614"/>
         <w:gridCol w:w="2788"/>
-        <w:gridCol w:w="2652"/>
+        <w:gridCol w:w="2653"/>
       </w:tblGrid>
       <w:tr>
         <w:trPr>
@@ -6625,7 +6534,7 @@
         </w:tc>
         <w:tc>
           <w:tcPr>
-            <w:tcW w:w="2615" w:type="dxa"/>
+            <w:tcW w:w="2614" w:type="dxa"/>
             <w:tcBorders>
               <w:left w:val="single" w:sz="4" w:space="0" w:color="000000"/>
               <w:bottom w:val="single" w:sz="4" w:space="0" w:color="000000"/>
@@ -7009,7 +6918,7 @@
         </w:tc>
         <w:tc>
           <w:tcPr>
-            <w:tcW w:w="2652" w:type="dxa"/>
+            <w:tcW w:w="2653" w:type="dxa"/>
             <w:tcBorders>
               <w:left w:val="single" w:sz="4" w:space="0" w:color="000000"/>
               <w:bottom w:val="single" w:sz="4" w:space="0" w:color="000000"/>
@@ -7474,7 +7383,7 @@
         </w:tc>
         <w:tc>
           <w:tcPr>
-            <w:tcW w:w="2615" w:type="dxa"/>
+            <w:tcW w:w="2614" w:type="dxa"/>
             <w:tcBorders>
               <w:top w:val="single" w:sz="4" w:space="0" w:color="000000"/>
               <w:left w:val="single" w:sz="4" w:space="0" w:color="000000"/>
@@ -7866,7 +7775,7 @@
         </w:tc>
         <w:tc>
           <w:tcPr>
-            <w:tcW w:w="2652" w:type="dxa"/>
+            <w:tcW w:w="2653" w:type="dxa"/>
             <w:tcBorders>
               <w:top w:val="single" w:sz="4" w:space="0" w:color="000000"/>
               <w:left w:val="single" w:sz="4" w:space="0" w:color="000000"/>
@@ -8593,7 +8502,7 @@
         </w:tc>
         <w:tc>
           <w:tcPr>
-            <w:tcW w:w="2615" w:type="dxa"/>
+            <w:tcW w:w="2614" w:type="dxa"/>
             <w:tcBorders>
               <w:top w:val="single" w:sz="4" w:space="0" w:color="000000"/>
               <w:left w:val="single" w:sz="4" w:space="0" w:color="000000"/>
@@ -8839,7 +8748,7 @@
         </w:tc>
         <w:tc>
           <w:tcPr>
-            <w:tcW w:w="2652" w:type="dxa"/>
+            <w:tcW w:w="2653" w:type="dxa"/>
             <w:tcBorders>
               <w:top w:val="single" w:sz="4" w:space="0" w:color="000000"/>
               <w:left w:val="single" w:sz="4" w:space="0" w:color="000000"/>

</xml_diff>